<commit_message>
Update db credentials for cloud hosting
</commit_message>
<xml_diff>
--- a/Project Report.docx
+++ b/Project Report.docx
@@ -105,82 +105,92 @@
         <w:spacing w:line="240" w:lineRule="auto"/>
       </w:pPr>
       <w:r>
-        <w:t>The goal of this project is to develop a database application for an Airline Management System. This system is designed to manage the core operational data of a commercial airline, including the scheduling of flights, management of aircraft fleets, and the processing of passenger reservations.</w:t>
-      </w:r>
-    </w:p>
-    <w:p>
-      <w:pPr>
-        <w:spacing w:line="240" w:lineRule="auto"/>
-      </w:pPr>
-      <w:r>
-        <w:t>The application will provide a centralized platform to handle</w:t>
-      </w:r>
-      <w:r>
-        <w:t>:</w:t>
-      </w:r>
-    </w:p>
-    <w:p>
-      <w:pPr>
-        <w:spacing w:line="240" w:lineRule="auto"/>
-      </w:pPr>
-      <w:r>
-        <w:t>Flight Scheduling: Tracking flight routes, including departure and arrival airports and scheduled times.</w:t>
-      </w:r>
-    </w:p>
-    <w:p>
-      <w:pPr>
-        <w:spacing w:line="240" w:lineRule="auto"/>
-      </w:pPr>
-      <w:r>
-        <w:t>Fleet Management: Maintaining records of individual aircraft, their models, and total passenger capacity.</w:t>
-      </w:r>
-    </w:p>
-    <w:p>
-      <w:pPr>
-        <w:spacing w:line="240" w:lineRule="auto"/>
-      </w:pPr>
-      <w:r>
-        <w:t>Employee</w:t>
-      </w:r>
-      <w:r>
-        <w:t xml:space="preserve"> Assignment: Assigning pilots and crew members to specific flights based on their rank and employee status.</w:t>
-      </w:r>
-    </w:p>
-    <w:p>
-      <w:pPr>
-        <w:spacing w:line="240" w:lineRule="auto"/>
-      </w:pPr>
-      <w:r>
-        <w:t xml:space="preserve">Reservation </w:t>
-      </w:r>
-      <w:r>
-        <w:t>Booking</w:t>
-      </w:r>
-      <w:r>
-        <w:t>: Facilitating the booking process where passengers are linked to specific flights and assigned seat numbers.</w:t>
-      </w:r>
-    </w:p>
-    <w:p>
-      <w:pPr>
-        <w:spacing w:line="240" w:lineRule="auto"/>
-      </w:pPr>
-      <w:r>
-        <w:t>A</w:t>
-      </w:r>
-      <w:r>
-        <w:t xml:space="preserve"> complex aspect of this application is </w:t>
-      </w:r>
-      <w:r>
-        <w:t>to ensure</w:t>
-      </w:r>
-      <w:r>
-        <w:t xml:space="preserve"> data integrity regarding seating capacity. </w:t>
-      </w:r>
-      <w:r>
-        <w:t>In a real-life scenario, flights are often overbooked but to reduce complexity of the application, t</w:t>
-      </w:r>
-      <w:r>
-        <w:t>he system must prevent overbooking by ensuring the number of records in the Booking relation does not exceed the Capacity defined in the Aircraft relation for a specific flight. Additionally, managing the many-to-many relationship between crew members and flights requires handling of scheduling conflicts.</w:t>
+        <w:t>The goal of this project is to develop a database application for an Airline Management System</w:t>
+      </w:r>
+      <w:r>
+        <w:t xml:space="preserve"> across US airports</w:t>
+      </w:r>
+      <w:r>
+        <w:t>. This system is designed to manage the core operational data of a commercial airline, including the scheduling of flights, management of aircraft fleets, and the processing of passenger reservations.</w:t>
+      </w:r>
+    </w:p>
+    <w:p>
+      <w:pPr>
+        <w:spacing w:line="240" w:lineRule="auto"/>
+      </w:pPr>
+      <w:r>
+        <w:t xml:space="preserve">The primary function of this system is to maintain data integrity while processing high-volume daily airline operations. It tracks real-world entities such as specific aircraft capacities, exact passenger passport identifications, employee payroll/roles, and airline flight scheduling. The </w:t>
+      </w:r>
+      <w:r>
+        <w:t>features</w:t>
+      </w:r>
+      <w:r>
+        <w:t xml:space="preserve"> provided by the graphical user interface (GUI) include:</w:t>
+      </w:r>
+    </w:p>
+    <w:p>
+      <w:pPr>
+        <w:pStyle w:val="ListParagraph"/>
+        <w:numPr>
+          <w:ilvl w:val="0"/>
+          <w:numId w:val="4"/>
+        </w:numPr>
+        <w:spacing w:line="240" w:lineRule="auto"/>
+      </w:pPr>
+      <w:r>
+        <w:t>Passenger Tracking: Allowing gate agents or administrators to view comprehensive passenger rosters for specific flights</w:t>
+      </w:r>
+    </w:p>
+    <w:p>
+      <w:pPr>
+        <w:pStyle w:val="ListParagraph"/>
+        <w:numPr>
+          <w:ilvl w:val="0"/>
+          <w:numId w:val="4"/>
+        </w:numPr>
+        <w:spacing w:line="240" w:lineRule="auto"/>
+      </w:pPr>
+      <w:r>
+        <w:t>Ticketing &amp; Cancellations: Processing new passenger bookings and canceling existing reservations</w:t>
+      </w:r>
+    </w:p>
+    <w:p>
+      <w:pPr>
+        <w:pStyle w:val="ListParagraph"/>
+        <w:numPr>
+          <w:ilvl w:val="0"/>
+          <w:numId w:val="4"/>
+        </w:numPr>
+        <w:spacing w:line="240" w:lineRule="auto"/>
+      </w:pPr>
+      <w:r>
+        <w:t xml:space="preserve">Logistical Analytics: Calculating the busiest transit hubs based on actual passenger traffic </w:t>
+      </w:r>
+    </w:p>
+    <w:p>
+      <w:pPr>
+        <w:pStyle w:val="ListParagraph"/>
+        <w:numPr>
+          <w:ilvl w:val="0"/>
+          <w:numId w:val="4"/>
+        </w:numPr>
+        <w:spacing w:line="240" w:lineRule="auto"/>
+      </w:pPr>
+      <w:r>
+        <w:t>Security &amp; Manifest Generation: Generating full flight manifests that combine both working crew members and ticketed passengers into a single list</w:t>
+      </w:r>
+    </w:p>
+    <w:p>
+      <w:pPr>
+        <w:pStyle w:val="ListParagraph"/>
+        <w:numPr>
+          <w:ilvl w:val="0"/>
+          <w:numId w:val="4"/>
+        </w:numPr>
+        <w:spacing w:line="240" w:lineRule="auto"/>
+      </w:pPr>
+      <w:r>
+        <w:t>Fleet Management Analytics: Aggregating data to determine airline operational scale and average fleet capacities</w:t>
       </w:r>
     </w:p>
     <w:p>
@@ -193,9 +203,17 @@
         </w:rPr>
         <w:lastRenderedPageBreak/>
         <w:drawing>
-          <wp:inline distT="0" distB="0" distL="0" distR="0" wp14:anchorId="6AF2962F" wp14:editId="690529DC">
+          <wp:anchor distT="0" distB="0" distL="114300" distR="114300" simplePos="0" relativeHeight="251659264" behindDoc="1" locked="0" layoutInCell="1" allowOverlap="1" wp14:anchorId="52E37CCD" wp14:editId="7C379684">
+            <wp:simplePos x="0" y="0"/>
+            <wp:positionH relativeFrom="page">
+              <wp:posOffset>914400</wp:posOffset>
+            </wp:positionH>
+            <wp:positionV relativeFrom="paragraph">
+              <wp:posOffset>289560</wp:posOffset>
+            </wp:positionV>
             <wp:extent cx="5943600" cy="3876675"/>
             <wp:effectExtent l="0" t="0" r="0" b="9525"/>
+            <wp:wrapSquare wrapText="bothSides"/>
             <wp:docPr id="1336146209" name="Picture 1"/>
             <wp:cNvGraphicFramePr>
               <a:graphicFrameLocks xmlns:a="http://schemas.openxmlformats.org/drawingml/2006/main" noChangeAspect="1"/>
@@ -231,7 +249,7 @@
                 </pic:pic>
               </a:graphicData>
             </a:graphic>
-          </wp:inline>
+          </wp:anchor>
         </w:drawing>
       </w:r>
     </w:p>
@@ -276,7 +294,6 @@
       <w:r>
         <w:t>Passenger(</w:t>
       </w:r>
-      <w:proofErr w:type="spellStart"/>
       <w:r>
         <w:rPr>
           <w:b/>
@@ -284,7 +301,6 @@
         </w:rPr>
         <w:t>PassportNum</w:t>
       </w:r>
-      <w:proofErr w:type="spellEnd"/>
       <w:r>
         <w:t>, Name, Phone)</w:t>
       </w:r>
@@ -301,7 +317,6 @@
       <w:r>
         <w:t>Employee(</w:t>
       </w:r>
-      <w:proofErr w:type="spellStart"/>
       <w:r>
         <w:rPr>
           <w:b/>
@@ -309,7 +324,6 @@
         </w:rPr>
         <w:t>EmployeeID</w:t>
       </w:r>
-      <w:proofErr w:type="spellEnd"/>
       <w:r>
         <w:t>, Name, Role, Salary)</w:t>
       </w:r>
@@ -326,7 +340,6 @@
       <w:r>
         <w:t>Airport(</w:t>
       </w:r>
-      <w:proofErr w:type="spellStart"/>
       <w:r>
         <w:rPr>
           <w:b/>
@@ -334,7 +347,6 @@
         </w:rPr>
         <w:t>IATACode</w:t>
       </w:r>
-      <w:proofErr w:type="spellEnd"/>
       <w:r>
         <w:t>, City, State, Country)</w:t>
       </w:r>
@@ -351,7 +363,6 @@
       <w:r>
         <w:t>Aircraft(</w:t>
       </w:r>
-      <w:proofErr w:type="spellStart"/>
       <w:r>
         <w:rPr>
           <w:b/>
@@ -359,7 +370,6 @@
         </w:rPr>
         <w:t>TailNum</w:t>
       </w:r>
-      <w:proofErr w:type="spellEnd"/>
       <w:r>
         <w:t>, Model, Capacity)</w:t>
       </w:r>
@@ -376,7 +386,6 @@
       <w:r>
         <w:t>Airline(</w:t>
       </w:r>
-      <w:proofErr w:type="spellStart"/>
       <w:r>
         <w:rPr>
           <w:b/>
@@ -384,7 +393,6 @@
         </w:rPr>
         <w:t>AirlineCode</w:t>
       </w:r>
-      <w:proofErr w:type="spellEnd"/>
       <w:r>
         <w:t>, Name)</w:t>
       </w:r>
@@ -398,20 +406,9 @@
         </w:numPr>
         <w:spacing w:line="240" w:lineRule="auto"/>
       </w:pPr>
-    </w:p>
-    <w:p>
-      <w:pPr>
-        <w:pStyle w:val="ListParagraph"/>
-        <w:numPr>
-          <w:ilvl w:val="1"/>
-          <w:numId w:val="3"/>
-        </w:numPr>
-        <w:spacing w:line="240" w:lineRule="auto"/>
-      </w:pPr>
       <w:r>
         <w:t>Flight(</w:t>
       </w:r>
-      <w:proofErr w:type="spellStart"/>
       <w:r>
         <w:rPr>
           <w:b/>
@@ -419,31 +416,12 @@
         </w:rPr>
         <w:t>FlightNum</w:t>
       </w:r>
-      <w:proofErr w:type="spellEnd"/>
-      <w:r>
-        <w:t xml:space="preserve">, Time, Status, </w:t>
-      </w:r>
-      <w:proofErr w:type="spellStart"/>
-      <w:r>
-        <w:t>TailNum</w:t>
-      </w:r>
-      <w:proofErr w:type="spellEnd"/>
-      <w:r>
-        <w:t xml:space="preserve">, </w:t>
-      </w:r>
-      <w:proofErr w:type="spellStart"/>
-      <w:r>
-        <w:t>OriginCode</w:t>
-      </w:r>
-      <w:proofErr w:type="spellEnd"/>
-      <w:r>
-        <w:t xml:space="preserve">, </w:t>
-      </w:r>
-      <w:proofErr w:type="spellStart"/>
-      <w:r>
-        <w:t>DestCode</w:t>
-      </w:r>
-      <w:proofErr w:type="spellEnd"/>
+      <w:r>
+        <w:t>, Time, Status, TailNum, OriginCode, DestCode</w:t>
+      </w:r>
+      <w:r>
+        <w:t>, AirlineCode</w:t>
+      </w:r>
       <w:r>
         <w:t>)</w:t>
       </w:r>
@@ -460,7 +438,6 @@
       <w:r>
         <w:t>Booking(</w:t>
       </w:r>
-      <w:proofErr w:type="spellStart"/>
       <w:r>
         <w:rPr>
           <w:b/>
@@ -468,25 +445,8 @@
         </w:rPr>
         <w:t>PassportNum</w:t>
       </w:r>
-      <w:proofErr w:type="spellEnd"/>
-      <w:r>
-        <w:t xml:space="preserve">, </w:t>
-      </w:r>
-      <w:proofErr w:type="spellStart"/>
-      <w:r>
-        <w:t>FlightNum</w:t>
-      </w:r>
-      <w:proofErr w:type="spellEnd"/>
-      <w:r>
-        <w:t xml:space="preserve">, </w:t>
-      </w:r>
-      <w:proofErr w:type="spellStart"/>
-      <w:r>
-        <w:t>SeatNum</w:t>
-      </w:r>
-      <w:proofErr w:type="spellEnd"/>
-      <w:r>
-        <w:t>)</w:t>
+      <w:r>
+        <w:t>, FlightNum, SeatNum)</w:t>
       </w:r>
     </w:p>
     <w:p>
@@ -501,7 +461,6 @@
       <w:r>
         <w:t>Staffing(</w:t>
       </w:r>
-      <w:proofErr w:type="spellStart"/>
       <w:r>
         <w:rPr>
           <w:b/>
@@ -509,17 +468,8 @@
         </w:rPr>
         <w:t>EmployeeID</w:t>
       </w:r>
-      <w:proofErr w:type="spellEnd"/>
-      <w:r>
-        <w:t xml:space="preserve">, </w:t>
-      </w:r>
-      <w:proofErr w:type="spellStart"/>
-      <w:r>
-        <w:t>FlightNum</w:t>
-      </w:r>
-      <w:proofErr w:type="spellEnd"/>
-      <w:r>
-        <w:t>)</w:t>
+      <w:r>
+        <w:t>, FlightNum)</w:t>
       </w:r>
     </w:p>
     <w:p>
@@ -544,13 +494,8 @@
         </w:numPr>
         <w:spacing w:line="240" w:lineRule="auto"/>
       </w:pPr>
-      <w:proofErr w:type="spellStart"/>
-      <w:r>
-        <w:t>PassportNum</w:t>
-      </w:r>
-      <w:proofErr w:type="spellEnd"/>
-      <w:r>
-        <w:t xml:space="preserve"> </w:t>
+      <w:r>
+        <w:t xml:space="preserve">PassportNum </w:t>
       </w:r>
       <w:r>
         <w:t>→</w:t>
@@ -574,13 +519,8 @@
         </w:numPr>
         <w:spacing w:line="240" w:lineRule="auto"/>
       </w:pPr>
-      <w:proofErr w:type="spellStart"/>
-      <w:r>
-        <w:t>EmployeeID</w:t>
-      </w:r>
-      <w:proofErr w:type="spellEnd"/>
-      <w:r>
-        <w:t xml:space="preserve"> </w:t>
+      <w:r>
+        <w:t xml:space="preserve">EmployeeID </w:t>
       </w:r>
       <w:r>
         <w:t>→</w:t>
@@ -604,13 +544,8 @@
         </w:numPr>
         <w:spacing w:line="240" w:lineRule="auto"/>
       </w:pPr>
-      <w:proofErr w:type="spellStart"/>
-      <w:r>
-        <w:t>IATACode</w:t>
-      </w:r>
-      <w:proofErr w:type="spellEnd"/>
-      <w:r>
-        <w:t xml:space="preserve"> </w:t>
+      <w:r>
+        <w:t xml:space="preserve">IATACode </w:t>
       </w:r>
       <w:r>
         <w:t xml:space="preserve">→ </w:t>
@@ -628,13 +563,8 @@
         </w:numPr>
         <w:spacing w:line="240" w:lineRule="auto"/>
       </w:pPr>
-      <w:proofErr w:type="spellStart"/>
-      <w:r>
-        <w:t>TailNum</w:t>
-      </w:r>
-      <w:proofErr w:type="spellEnd"/>
-      <w:r>
-        <w:t xml:space="preserve"> </w:t>
+      <w:r>
+        <w:t xml:space="preserve">TailNum </w:t>
       </w:r>
       <w:r>
         <w:t xml:space="preserve">→ </w:t>
@@ -652,41 +582,9 @@
         </w:numPr>
         <w:spacing w:line="240" w:lineRule="auto"/>
       </w:pPr>
-      <w:proofErr w:type="spellStart"/>
-      <w:r>
-        <w:t>FlightNum</w:t>
-      </w:r>
-      <w:proofErr w:type="spellEnd"/>
-      <w:r>
-        <w:t xml:space="preserve"> </w:t>
-      </w:r>
-      <w:r>
-        <w:t xml:space="preserve">→ </w:t>
-      </w:r>
-      <w:r>
-        <w:t xml:space="preserve">Time, Status, </w:t>
-      </w:r>
-      <w:proofErr w:type="spellStart"/>
-      <w:r>
-        <w:t>TailNum</w:t>
-      </w:r>
-      <w:proofErr w:type="spellEnd"/>
-      <w:r>
-        <w:t xml:space="preserve">, </w:t>
-      </w:r>
-      <w:proofErr w:type="spellStart"/>
-      <w:r>
-        <w:t>OriginCode</w:t>
-      </w:r>
-      <w:proofErr w:type="spellEnd"/>
-      <w:r>
-        <w:t xml:space="preserve">, </w:t>
-      </w:r>
-      <w:proofErr w:type="spellStart"/>
-      <w:r>
-        <w:t>DestCode</w:t>
-      </w:r>
-      <w:proofErr w:type="spellEnd"/>
+      <w:r>
+        <w:t>AirlineCode → Name</w:t>
+      </w:r>
     </w:p>
     <w:p>
       <w:pPr>
@@ -697,30 +595,37 @@
         </w:numPr>
         <w:spacing w:line="240" w:lineRule="auto"/>
       </w:pPr>
-      <w:proofErr w:type="spellStart"/>
-      <w:r>
-        <w:t>PassportNum</w:t>
-      </w:r>
-      <w:proofErr w:type="spellEnd"/>
-      <w:r>
-        <w:t xml:space="preserve">, </w:t>
-      </w:r>
-      <w:proofErr w:type="spellStart"/>
-      <w:r>
-        <w:t>FlightNum</w:t>
-      </w:r>
-      <w:proofErr w:type="spellEnd"/>
-      <w:r>
-        <w:t xml:space="preserve"> </w:t>
+      <w:r>
+        <w:t xml:space="preserve">FlightNum </w:t>
       </w:r>
       <w:r>
         <w:t xml:space="preserve">→ </w:t>
       </w:r>
-      <w:proofErr w:type="spellStart"/>
+      <w:r>
+        <w:t>Time, Status, TailNum, OriginCode, DestCode</w:t>
+      </w:r>
+      <w:r>
+        <w:t>, AirlineCode</w:t>
+      </w:r>
+    </w:p>
+    <w:p>
+      <w:pPr>
+        <w:pStyle w:val="ListParagraph"/>
+        <w:numPr>
+          <w:ilvl w:val="1"/>
+          <w:numId w:val="3"/>
+        </w:numPr>
+        <w:spacing w:line="240" w:lineRule="auto"/>
+      </w:pPr>
+      <w:r>
+        <w:t xml:space="preserve">PassportNum, FlightNum </w:t>
+      </w:r>
+      <w:r>
+        <w:t xml:space="preserve">→ </w:t>
+      </w:r>
       <w:r>
         <w:t>SeatNum</w:t>
       </w:r>
-      <w:proofErr w:type="spellEnd"/>
     </w:p>
     <w:p>
       <w:pPr>
@@ -732,15 +637,8 @@
         <w:spacing w:line="240" w:lineRule="auto"/>
       </w:pPr>
       <w:r>
-        <w:t xml:space="preserve">To determine if the database schema is in Boyce-Codd Normal Form (BCNF), we must evaluate each relation to ensure that for every non-trivial functional dependency X → Y, the determinant X is a </w:t>
-      </w:r>
-      <w:proofErr w:type="spellStart"/>
-      <w:r>
-        <w:t>superkey</w:t>
-      </w:r>
-      <w:proofErr w:type="spellEnd"/>
-      <w:r>
-        <w:t xml:space="preserve">. </w:t>
+        <w:lastRenderedPageBreak/>
+        <w:t xml:space="preserve">To determine if the database schema is in Boyce-Codd Normal Form (BCNF), we must evaluate each relation to ensure that for every non-trivial functional dependency X → Y, the determinant X is a superkey. </w:t>
       </w:r>
     </w:p>
     <w:p>
@@ -752,14 +650,8 @@
         </w:numPr>
         <w:spacing w:line="240" w:lineRule="auto"/>
       </w:pPr>
-      <w:proofErr w:type="spellStart"/>
-      <w:r>
-        <w:lastRenderedPageBreak/>
-        <w:t>PassportNum</w:t>
-      </w:r>
-      <w:proofErr w:type="spellEnd"/>
-      <w:r>
-        <w:t xml:space="preserve"> </w:t>
+      <w:r>
+        <w:t xml:space="preserve">PassportNum </w:t>
       </w:r>
       <w:r>
         <w:t>→</w:t>
@@ -777,21 +669,8 @@
         <w:t>: Not a violation</w:t>
       </w:r>
       <w:r>
-        <w:t xml:space="preserve"> since </w:t>
-      </w:r>
-      <w:proofErr w:type="spellStart"/>
-      <w:r>
-        <w:t>PassportNum</w:t>
-      </w:r>
-      <w:proofErr w:type="spellEnd"/>
-      <w:r>
-        <w:t xml:space="preserve"> is the primary key, it is the </w:t>
-      </w:r>
-      <w:proofErr w:type="spellStart"/>
-      <w:r>
-        <w:t>superkey</w:t>
-      </w:r>
-      <w:proofErr w:type="spellEnd"/>
+        <w:t xml:space="preserve"> since PassportNum is the primary key, it is the superkey</w:t>
+      </w:r>
       <w:r>
         <w:t xml:space="preserve">. </w:t>
       </w:r>
@@ -805,13 +684,8 @@
         </w:numPr>
         <w:spacing w:line="240" w:lineRule="auto"/>
       </w:pPr>
-      <w:proofErr w:type="spellStart"/>
-      <w:r>
-        <w:t>EmployeeID</w:t>
-      </w:r>
-      <w:proofErr w:type="spellEnd"/>
-      <w:r>
-        <w:t xml:space="preserve"> </w:t>
+      <w:r>
+        <w:t xml:space="preserve">EmployeeID </w:t>
       </w:r>
       <w:r>
         <w:t>→</w:t>
@@ -826,23 +700,7 @@
         <w:t>Role, Salary</w:t>
       </w:r>
       <w:r>
-        <w:t xml:space="preserve">: Not a violation since </w:t>
-      </w:r>
-      <w:proofErr w:type="spellStart"/>
-      <w:r>
-        <w:t>EmployeeID</w:t>
-      </w:r>
-      <w:proofErr w:type="spellEnd"/>
-      <w:r>
-        <w:t xml:space="preserve"> is the primary key, it is the </w:t>
-      </w:r>
-      <w:proofErr w:type="spellStart"/>
-      <w:r>
-        <w:t>superkey</w:t>
-      </w:r>
-      <w:proofErr w:type="spellEnd"/>
-      <w:r>
-        <w:t xml:space="preserve">. </w:t>
+        <w:t xml:space="preserve">: Not a violation since EmployeeID is the primary key, it is the superkey. </w:t>
       </w:r>
     </w:p>
     <w:p>
@@ -854,13 +712,8 @@
         </w:numPr>
         <w:spacing w:line="240" w:lineRule="auto"/>
       </w:pPr>
-      <w:proofErr w:type="spellStart"/>
-      <w:r>
-        <w:t>IATACode</w:t>
-      </w:r>
-      <w:proofErr w:type="spellEnd"/>
-      <w:r>
-        <w:t xml:space="preserve"> </w:t>
+      <w:r>
+        <w:t xml:space="preserve">IATACode </w:t>
       </w:r>
       <w:r>
         <w:t xml:space="preserve">→ </w:t>
@@ -872,21 +725,8 @@
         <w:t>: Not a violation</w:t>
       </w:r>
       <w:r>
-        <w:t xml:space="preserve"> since </w:t>
-      </w:r>
-      <w:proofErr w:type="spellStart"/>
-      <w:r>
-        <w:t>IATACode</w:t>
-      </w:r>
-      <w:proofErr w:type="spellEnd"/>
-      <w:r>
-        <w:t xml:space="preserve"> is the primary key, it is the </w:t>
-      </w:r>
-      <w:proofErr w:type="spellStart"/>
-      <w:r>
-        <w:t>superkey</w:t>
-      </w:r>
-      <w:proofErr w:type="spellEnd"/>
+        <w:t xml:space="preserve"> since IATACode is the primary key, it is the superkey</w:t>
+      </w:r>
       <w:r>
         <w:t>.</w:t>
       </w:r>
@@ -900,13 +740,8 @@
         </w:numPr>
         <w:spacing w:line="240" w:lineRule="auto"/>
       </w:pPr>
-      <w:proofErr w:type="spellStart"/>
-      <w:r>
-        <w:t>TailNum</w:t>
-      </w:r>
-      <w:proofErr w:type="spellEnd"/>
-      <w:r>
-        <w:t xml:space="preserve"> </w:t>
+      <w:r>
+        <w:t xml:space="preserve">TailNum </w:t>
       </w:r>
       <w:r>
         <w:t xml:space="preserve">→ </w:t>
@@ -918,23 +753,7 @@
         <w:t>: Not a violation</w:t>
       </w:r>
       <w:r>
-        <w:t xml:space="preserve"> since </w:t>
-      </w:r>
-      <w:proofErr w:type="spellStart"/>
-      <w:r>
-        <w:t>TailNum</w:t>
-      </w:r>
-      <w:proofErr w:type="spellEnd"/>
-      <w:r>
-        <w:t xml:space="preserve"> is the primary key, it is the </w:t>
-      </w:r>
-      <w:proofErr w:type="spellStart"/>
-      <w:r>
-        <w:t>superkey</w:t>
-      </w:r>
-      <w:proofErr w:type="spellEnd"/>
-      <w:r>
-        <w:t>.</w:t>
+        <w:t xml:space="preserve"> since TailNum is the primary key, it is the superkey.</w:t>
       </w:r>
     </w:p>
     <w:p>
@@ -946,62 +765,8 @@
         </w:numPr>
         <w:spacing w:line="240" w:lineRule="auto"/>
       </w:pPr>
-      <w:proofErr w:type="spellStart"/>
-      <w:r>
-        <w:t>FlightNum</w:t>
-      </w:r>
-      <w:proofErr w:type="spellEnd"/>
-      <w:r>
-        <w:t xml:space="preserve"> </w:t>
-      </w:r>
-      <w:r>
-        <w:t xml:space="preserve">→ </w:t>
-      </w:r>
-      <w:r>
-        <w:t xml:space="preserve">Time, Status, </w:t>
-      </w:r>
-      <w:proofErr w:type="spellStart"/>
-      <w:r>
-        <w:t>TailNum</w:t>
-      </w:r>
-      <w:proofErr w:type="spellEnd"/>
-      <w:r>
-        <w:t xml:space="preserve">, </w:t>
-      </w:r>
-      <w:proofErr w:type="spellStart"/>
-      <w:r>
-        <w:t>OriginCode</w:t>
-      </w:r>
-      <w:proofErr w:type="spellEnd"/>
-      <w:r>
-        <w:t xml:space="preserve">, </w:t>
-      </w:r>
-      <w:proofErr w:type="spellStart"/>
-      <w:r>
-        <w:t>DestCode</w:t>
-      </w:r>
-      <w:proofErr w:type="spellEnd"/>
-      <w:r>
-        <w:t>: Not a violation</w:t>
-      </w:r>
-      <w:r>
-        <w:t xml:space="preserve"> since </w:t>
-      </w:r>
-      <w:proofErr w:type="spellStart"/>
-      <w:r>
-        <w:t>FlightNum</w:t>
-      </w:r>
-      <w:proofErr w:type="spellEnd"/>
-      <w:r>
-        <w:t xml:space="preserve"> is the primary key, it is the </w:t>
-      </w:r>
-      <w:proofErr w:type="spellStart"/>
-      <w:r>
-        <w:t>superkey</w:t>
-      </w:r>
-      <w:proofErr w:type="spellEnd"/>
-      <w:r>
-        <w:t>.</w:t>
+      <w:r>
+        <w:t>AirlineCode → Name: Not a violation since AirlineCode is the primary key, it is the superkey.</w:t>
       </w:r>
     </w:p>
     <w:p>
@@ -1013,59 +778,23 @@
         </w:numPr>
         <w:spacing w:line="240" w:lineRule="auto"/>
       </w:pPr>
-      <w:proofErr w:type="spellStart"/>
-      <w:r>
-        <w:t>PassportNum</w:t>
-      </w:r>
-      <w:proofErr w:type="spellEnd"/>
-      <w:r>
-        <w:t xml:space="preserve">, </w:t>
-      </w:r>
-      <w:proofErr w:type="spellStart"/>
-      <w:r>
-        <w:t>FlightNum</w:t>
-      </w:r>
-      <w:proofErr w:type="spellEnd"/>
-      <w:r>
-        <w:t xml:space="preserve"> </w:t>
+      <w:r>
+        <w:t xml:space="preserve">FlightNum </w:t>
       </w:r>
       <w:r>
         <w:t xml:space="preserve">→ </w:t>
       </w:r>
-      <w:proofErr w:type="spellStart"/>
-      <w:r>
-        <w:t>SeatNum</w:t>
-      </w:r>
-      <w:proofErr w:type="spellEnd"/>
+      <w:r>
+        <w:t>Time, Status, TailNum, OriginCode, DestCode</w:t>
+      </w:r>
+      <w:r>
+        <w:t>, AirlineCode</w:t>
+      </w:r>
       <w:r>
         <w:t>: Not a violation</w:t>
       </w:r>
       <w:r>
-        <w:t xml:space="preserve"> since the composite attribute (</w:t>
-      </w:r>
-      <w:proofErr w:type="spellStart"/>
-      <w:r>
-        <w:t>PassportNum</w:t>
-      </w:r>
-      <w:proofErr w:type="spellEnd"/>
-      <w:r>
-        <w:t xml:space="preserve">, </w:t>
-      </w:r>
-      <w:proofErr w:type="spellStart"/>
-      <w:r>
-        <w:t>FlightNum</w:t>
-      </w:r>
-      <w:proofErr w:type="spellEnd"/>
-      <w:r>
-        <w:t xml:space="preserve">) is the primary key, it is the </w:t>
-      </w:r>
-      <w:proofErr w:type="spellStart"/>
-      <w:r>
-        <w:t>superkey</w:t>
-      </w:r>
-      <w:proofErr w:type="spellEnd"/>
-      <w:r>
-        <w:t>.</w:t>
+        <w:t xml:space="preserve"> since FlightNum is the primary key, it is the superkey.</w:t>
       </w:r>
     </w:p>
     <w:p>
@@ -1078,6 +807,34 @@
         <w:spacing w:line="240" w:lineRule="auto"/>
       </w:pPr>
       <w:r>
+        <w:t xml:space="preserve">PassportNum, FlightNum </w:t>
+      </w:r>
+      <w:r>
+        <w:t xml:space="preserve">→ </w:t>
+      </w:r>
+      <w:r>
+        <w:t>SeatNum</w:t>
+      </w:r>
+      <w:r>
+        <w:t>: Not a violation</w:t>
+      </w:r>
+      <w:r>
+        <w:t xml:space="preserve"> since the composite attribute (PassportNum, FlightNum) is the primary key, it is the superkey</w:t>
+      </w:r>
+      <w:r>
+        <w:t>.</w:t>
+      </w:r>
+    </w:p>
+    <w:p>
+      <w:pPr>
+        <w:pStyle w:val="ListParagraph"/>
+        <w:numPr>
+          <w:ilvl w:val="1"/>
+          <w:numId w:val="3"/>
+        </w:numPr>
+        <w:spacing w:line="240" w:lineRule="auto"/>
+      </w:pPr>
+      <w:r>
         <w:t>Discussion and Results:</w:t>
       </w:r>
     </w:p>
@@ -1105,7 +862,13 @@
         <w:t xml:space="preserve"> </w:t>
       </w:r>
       <w:r>
-        <w:t>The relations pass the BCNF test because every determinant in the schema is a candidate key</w:t>
+        <w:t xml:space="preserve">The relations </w:t>
+      </w:r>
+      <w:r>
+        <w:t>are in BCNF</w:t>
+      </w:r>
+      <w:r>
+        <w:t xml:space="preserve"> because every determinant in the schema is a candidate key</w:t>
       </w:r>
       <w:r>
         <w:t xml:space="preserve"> b</w:t>
@@ -1117,31 +880,329 @@
         <w:t>which</w:t>
       </w:r>
       <w:r>
-        <w:t xml:space="preserve">, the relations have no redundancies or update anomalies. For example, if an airport's city or country changes, that data only exists in the Airport table. The Flight table safely references the airport via the </w:t>
-      </w:r>
-      <w:proofErr w:type="spellStart"/>
-      <w:r>
-        <w:t>IATACode</w:t>
-      </w:r>
-      <w:proofErr w:type="spellEnd"/>
-      <w:r>
-        <w:t xml:space="preserve"> foreign keys (</w:t>
-      </w:r>
-      <w:proofErr w:type="spellStart"/>
-      <w:r>
-        <w:t>OriginCode</w:t>
-      </w:r>
-      <w:proofErr w:type="spellEnd"/>
-      <w:r>
-        <w:t xml:space="preserve"> and </w:t>
-      </w:r>
-      <w:proofErr w:type="spellStart"/>
-      <w:r>
-        <w:t>DestCode</w:t>
-      </w:r>
-      <w:proofErr w:type="spellEnd"/>
-      <w:r>
-        <w:t>) without duplicating the geographical data, ensuring data integrity across the database.</w:t>
+        <w:t>, the relations have no redundancies or update anomalies. For example, if an airport's city or country changes, that data only exists in the Airport table. The Flight table safely references the airport via the IATACode foreign keys (OriginCode and DestCode) without duplicating the geographical data, ensuring data integrity across the database.</w:t>
+      </w:r>
+    </w:p>
+    <w:p>
+      <w:pPr>
+        <w:spacing w:line="240" w:lineRule="auto"/>
+        <w:rPr>
+          <w:b/>
+          <w:bCs/>
+        </w:rPr>
+      </w:pPr>
+      <w:r>
+        <w:rPr>
+          <w:b/>
+          <w:bCs/>
+        </w:rPr>
+        <w:t>Part E. Submitting your project</w:t>
+      </w:r>
+    </w:p>
+    <w:p>
+      <w:pPr>
+        <w:pStyle w:val="ListParagraph"/>
+        <w:numPr>
+          <w:ilvl w:val="0"/>
+          <w:numId w:val="5"/>
+        </w:numPr>
+        <w:spacing w:line="240" w:lineRule="auto"/>
+      </w:pPr>
+      <w:r>
+        <w:t>Refer to page 1.</w:t>
+      </w:r>
+    </w:p>
+    <w:p>
+      <w:pPr>
+        <w:pStyle w:val="ListParagraph"/>
+        <w:numPr>
+          <w:ilvl w:val="0"/>
+          <w:numId w:val="5"/>
+        </w:numPr>
+        <w:spacing w:line="240" w:lineRule="auto"/>
+      </w:pPr>
+      <w:r>
+        <w:t>Refer to page 2.</w:t>
+      </w:r>
+    </w:p>
+    <w:p>
+      <w:pPr>
+        <w:pStyle w:val="ListParagraph"/>
+        <w:numPr>
+          <w:ilvl w:val="0"/>
+          <w:numId w:val="5"/>
+        </w:numPr>
+        <w:spacing w:line="240" w:lineRule="auto"/>
+      </w:pPr>
+      <w:r>
+        <w:t>Refer to page 2 and 3.</w:t>
+      </w:r>
+    </w:p>
+    <w:p>
+      <w:pPr>
+        <w:pStyle w:val="ListParagraph"/>
+        <w:numPr>
+          <w:ilvl w:val="0"/>
+          <w:numId w:val="5"/>
+        </w:numPr>
+        <w:spacing w:line="240" w:lineRule="auto"/>
+      </w:pPr>
+      <w:r>
+        <w:t>The d</w:t>
+      </w:r>
+      <w:r>
+        <w:t>ata</w:t>
+      </w:r>
+      <w:r>
+        <w:t xml:space="preserve"> for this</w:t>
+      </w:r>
+      <w:r>
+        <w:t xml:space="preserve"> was fabricated using a custom Python script utilizing the Faker library, </w:t>
+      </w:r>
+      <w:r>
+        <w:t>along</w:t>
+      </w:r>
+      <w:r>
+        <w:t xml:space="preserve"> with a manually curated dataset of real-world US Airport IATA codes and Major US Airline codes.</w:t>
+      </w:r>
+      <w:r>
+        <w:t xml:space="preserve"> </w:t>
+      </w:r>
+      <w:r>
+        <w:t>To ensure the uniqueness of key attributes, the Python script utilized Faker's .unique method for attributes like PassportNum and TailNum. For composite keys like in the Booking table, the script employed Python set() data structures and while loops to guarantee no duplicate (PassportNum, FlightNum) pairs were generated.</w:t>
+      </w:r>
+      <w:r>
+        <w:t xml:space="preserve"> </w:t>
+      </w:r>
+      <w:r>
+        <w:t>To avoid empty query results, the data generation strictly followed a parent-child hierarchy</w:t>
+      </w:r>
+      <w:r>
+        <w:t xml:space="preserve"> where i</w:t>
+      </w:r>
+      <w:r>
+        <w:t>ndependent tables (Airport, Aircraft, Passenger) were generated first. When generating dependent tables like Flight or Booking, the script specifically randomly selected foreign keys only from the pre-generated lists of primary keys. This ensured</w:t>
+      </w:r>
+      <w:r>
+        <w:t xml:space="preserve"> </w:t>
+      </w:r>
+      <w:r>
+        <w:t xml:space="preserve">referential integrity and guaranteed </w:t>
+      </w:r>
+      <w:r>
+        <w:lastRenderedPageBreak/>
+        <w:t>that every flight had valid airports, and every booking connected a valid passenger to a valid flight.</w:t>
+      </w:r>
+    </w:p>
+    <w:p>
+      <w:pPr>
+        <w:pStyle w:val="ListParagraph"/>
+        <w:numPr>
+          <w:ilvl w:val="0"/>
+          <w:numId w:val="5"/>
+        </w:numPr>
+        <w:spacing w:line="240" w:lineRule="auto"/>
+      </w:pPr>
+      <w:r>
+        <w:t xml:space="preserve">The user interface </w:t>
+      </w:r>
+      <w:r>
+        <w:t>was</w:t>
+      </w:r>
+      <w:r>
+        <w:t xml:space="preserve"> developed in Python using Streamlit, with PostgreSQL access handled through SQLAlchemy using the psycopg2 driver under the hood. Users interact through a</w:t>
+      </w:r>
+      <w:r>
+        <w:t xml:space="preserve"> collapsible</w:t>
+      </w:r>
+      <w:r>
+        <w:t xml:space="preserve"> sidebar navigation menu with radio-button operation selection, and provide input through text fields, select boxes, forms, and numeric steppers.</w:t>
+      </w:r>
+      <w:r>
+        <w:t xml:space="preserve"> The application supports the following functions:</w:t>
+      </w:r>
+    </w:p>
+    <w:p>
+      <w:pPr>
+        <w:pStyle w:val="ListParagraph"/>
+        <w:numPr>
+          <w:ilvl w:val="1"/>
+          <w:numId w:val="5"/>
+        </w:numPr>
+        <w:spacing w:line="240" w:lineRule="auto"/>
+      </w:pPr>
+      <w:r>
+        <w:t>View Flight Passenger Roster: Uses an INNER JOIN between Passenger and Booking filtered by a user-provided FlightNum.</w:t>
+      </w:r>
+    </w:p>
+    <w:p>
+      <w:pPr>
+        <w:pStyle w:val="ListParagraph"/>
+        <w:numPr>
+          <w:ilvl w:val="1"/>
+          <w:numId w:val="5"/>
+        </w:numPr>
+        <w:spacing w:line="240" w:lineRule="auto"/>
+      </w:pPr>
+      <w:r>
+        <w:t xml:space="preserve">Book a New Flight: </w:t>
+      </w:r>
+      <w:r>
+        <w:t xml:space="preserve">Searches for whether the passenger already exists in the system. If no, they’re added to the Passenger and then the Booking table. If yes, </w:t>
+      </w:r>
+      <w:r>
+        <w:t>they’re added to the Booking table</w:t>
+      </w:r>
+      <w:r>
+        <w:t xml:space="preserve"> only. </w:t>
+      </w:r>
+      <w:r>
+        <w:t>Uses an INSERT INTO statement to modify the database with a new passenger reservation.</w:t>
+      </w:r>
+    </w:p>
+    <w:p>
+      <w:pPr>
+        <w:pStyle w:val="ListParagraph"/>
+        <w:numPr>
+          <w:ilvl w:val="1"/>
+          <w:numId w:val="5"/>
+        </w:numPr>
+        <w:spacing w:line="240" w:lineRule="auto"/>
+      </w:pPr>
+      <w:r>
+        <w:t>Busiest Airports</w:t>
+      </w:r>
+      <w:r>
+        <w:t>:</w:t>
+      </w:r>
+      <w:r>
+        <w:t xml:space="preserve"> Uses a query with multiple JOINs, an OR condition to check both origin and destination airports, an aggregate COUNT(), and a GROUP BY clause, filtered by a user-defined LIMIT.</w:t>
+      </w:r>
+    </w:p>
+    <w:p>
+      <w:pPr>
+        <w:pStyle w:val="ListParagraph"/>
+        <w:numPr>
+          <w:ilvl w:val="1"/>
+          <w:numId w:val="5"/>
+        </w:numPr>
+        <w:spacing w:line="240" w:lineRule="auto"/>
+      </w:pPr>
+      <w:r>
+        <w:t xml:space="preserve">Retrieve </w:t>
+      </w:r>
+      <w:r>
+        <w:t xml:space="preserve">Flight Manifest: Utilizes the UNION set operator to merge the results of two separate queries (passengers and employees) into a single </w:t>
+      </w:r>
+      <w:r>
+        <w:t>list</w:t>
+      </w:r>
+      <w:r>
+        <w:t>.</w:t>
+      </w:r>
+    </w:p>
+    <w:p>
+      <w:pPr>
+        <w:pStyle w:val="ListParagraph"/>
+        <w:numPr>
+          <w:ilvl w:val="1"/>
+          <w:numId w:val="5"/>
+        </w:numPr>
+        <w:spacing w:line="240" w:lineRule="auto"/>
+      </w:pPr>
+      <w:r>
+        <w:t>Airline Fleet Statistics: Utilizes a subquery in the SELECT clause to calculate the average aircraft capacity per airline, combined with standard aggregations and GROUP BY.</w:t>
+      </w:r>
+    </w:p>
+    <w:p>
+      <w:pPr>
+        <w:pStyle w:val="ListParagraph"/>
+        <w:numPr>
+          <w:ilvl w:val="1"/>
+          <w:numId w:val="5"/>
+        </w:numPr>
+        <w:spacing w:line="240" w:lineRule="auto"/>
+      </w:pPr>
+      <w:r>
+        <w:t>Cancel a Booking: Uses a DELETE FROM modification statement with WHERE conditions to remove specific records.</w:t>
+      </w:r>
+    </w:p>
+    <w:p>
+      <w:pPr>
+        <w:pStyle w:val="ListParagraph"/>
+        <w:numPr>
+          <w:ilvl w:val="0"/>
+          <w:numId w:val="5"/>
+        </w:numPr>
+        <w:spacing w:line="240" w:lineRule="auto"/>
+      </w:pPr>
+      <w:r>
+        <w:t xml:space="preserve">The main application is </w:t>
+      </w:r>
+      <w:r>
+        <w:rPr>
+          <w:i/>
+          <w:iCs/>
+        </w:rPr>
+        <w:t>app.</w:t>
+      </w:r>
+      <w:r>
+        <w:rPr>
+          <w:i/>
+          <w:iCs/>
+        </w:rPr>
+        <w:t>p</w:t>
+      </w:r>
+      <w:r>
+        <w:rPr>
+          <w:i/>
+          <w:iCs/>
+        </w:rPr>
+        <w:t>y</w:t>
+      </w:r>
+      <w:r>
+        <w:rPr>
+          <w:b/>
+          <w:bCs/>
+          <w:i/>
+          <w:iCs/>
+        </w:rPr>
+        <w:t xml:space="preserve"> </w:t>
+      </w:r>
+      <w:r>
+        <w:t xml:space="preserve">and the records are generated by </w:t>
+      </w:r>
+      <w:r>
+        <w:rPr>
+          <w:i/>
+          <w:iCs/>
+        </w:rPr>
+        <w:t>data.py</w:t>
+      </w:r>
+      <w:r>
+        <w:t>.</w:t>
+      </w:r>
+    </w:p>
+    <w:p>
+      <w:pPr>
+        <w:pStyle w:val="ListParagraph"/>
+        <w:numPr>
+          <w:ilvl w:val="0"/>
+          <w:numId w:val="5"/>
+        </w:numPr>
+        <w:spacing w:line="240" w:lineRule="auto"/>
+      </w:pPr>
+      <w:r>
+        <w:t>A major challenge was designing the database and trying to figure out the overall picture of what attributes are necessary, which required quite a few iterations. Another significant challenge I encountered was managing foreign key constraint violations during the data import phase. When initially testing the data generation script, generating child tables (like Booking) without generating parent tables (Passenger) resulted in fatal psql exit codes during import. I overcame this by implementing a strict TRUNCATE ... CASCADE workflow and ensuring the Python script generated all related datasets simultaneously to maintain referential integrity.</w:t>
+      </w:r>
+    </w:p>
+    <w:p>
+      <w:pPr>
+        <w:pStyle w:val="ListParagraph"/>
+        <w:spacing w:line="240" w:lineRule="auto"/>
+      </w:pPr>
+      <w:r>
+        <w:t>Another challenge involved bridging Python web frameworks with SQL parameters. I initially faced a database-connection compatibility issue in pandas as it only supports SQLAlchemy connectable, whereas I was solely using a psycopg2 connection. This required me to revise all queries to support the SQLAlchemy format. Additionally, when attempting to pass user input into a LIMIT clause using Pandas' read_sql_query, the underlying SQLAlchemy engine misinterpreted the %s placeholder, causing syntax errors. I resolved this by utilizing safe string concatenation for integers. Ultimately, this project provided valuable hands-on experience in full-stack database development, from E-R modeling to UI deployment.</w:t>
       </w:r>
     </w:p>
     <w:sectPr>
@@ -1246,6 +1307,95 @@
     </w:lvl>
   </w:abstractNum>
   <w:abstractNum w:abstractNumId="1" w15:restartNumberingAfterBreak="0">
+    <w:nsid w:val="30962852"/>
+    <w:multiLevelType w:val="hybridMultilevel"/>
+    <w:tmpl w:val="FEE0A4CA"/>
+    <w:lvl w:ilvl="0" w:tplc="57C4558A">
+      <w:start w:val="1"/>
+      <w:numFmt w:val="lowerLetter"/>
+      <w:lvlText w:val="(%1)"/>
+      <w:lvlJc w:val="left"/>
+      <w:pPr>
+        <w:ind w:left="720" w:hanging="360"/>
+      </w:pPr>
+      <w:rPr>
+        <w:rFonts w:hint="default"/>
+      </w:rPr>
+    </w:lvl>
+    <w:lvl w:ilvl="1" w:tplc="04090019">
+      <w:start w:val="1"/>
+      <w:numFmt w:val="lowerLetter"/>
+      <w:lvlText w:val="%2."/>
+      <w:lvlJc w:val="left"/>
+      <w:pPr>
+        <w:ind w:left="1440" w:hanging="360"/>
+      </w:pPr>
+    </w:lvl>
+    <w:lvl w:ilvl="2" w:tplc="0409001B" w:tentative="1">
+      <w:start w:val="1"/>
+      <w:numFmt w:val="lowerRoman"/>
+      <w:lvlText w:val="%3."/>
+      <w:lvlJc w:val="right"/>
+      <w:pPr>
+        <w:ind w:left="2160" w:hanging="180"/>
+      </w:pPr>
+    </w:lvl>
+    <w:lvl w:ilvl="3" w:tplc="0409000F" w:tentative="1">
+      <w:start w:val="1"/>
+      <w:numFmt w:val="decimal"/>
+      <w:lvlText w:val="%4."/>
+      <w:lvlJc w:val="left"/>
+      <w:pPr>
+        <w:ind w:left="2880" w:hanging="360"/>
+      </w:pPr>
+    </w:lvl>
+    <w:lvl w:ilvl="4" w:tplc="04090019" w:tentative="1">
+      <w:start w:val="1"/>
+      <w:numFmt w:val="lowerLetter"/>
+      <w:lvlText w:val="%5."/>
+      <w:lvlJc w:val="left"/>
+      <w:pPr>
+        <w:ind w:left="3600" w:hanging="360"/>
+      </w:pPr>
+    </w:lvl>
+    <w:lvl w:ilvl="5" w:tplc="0409001B" w:tentative="1">
+      <w:start w:val="1"/>
+      <w:numFmt w:val="lowerRoman"/>
+      <w:lvlText w:val="%6."/>
+      <w:lvlJc w:val="right"/>
+      <w:pPr>
+        <w:ind w:left="4320" w:hanging="180"/>
+      </w:pPr>
+    </w:lvl>
+    <w:lvl w:ilvl="6" w:tplc="0409000F" w:tentative="1">
+      <w:start w:val="1"/>
+      <w:numFmt w:val="decimal"/>
+      <w:lvlText w:val="%7."/>
+      <w:lvlJc w:val="left"/>
+      <w:pPr>
+        <w:ind w:left="5040" w:hanging="360"/>
+      </w:pPr>
+    </w:lvl>
+    <w:lvl w:ilvl="7" w:tplc="04090019" w:tentative="1">
+      <w:start w:val="1"/>
+      <w:numFmt w:val="lowerLetter"/>
+      <w:lvlText w:val="%8."/>
+      <w:lvlJc w:val="left"/>
+      <w:pPr>
+        <w:ind w:left="5760" w:hanging="360"/>
+      </w:pPr>
+    </w:lvl>
+    <w:lvl w:ilvl="8" w:tplc="0409001B" w:tentative="1">
+      <w:start w:val="1"/>
+      <w:numFmt w:val="lowerRoman"/>
+      <w:lvlText w:val="%9."/>
+      <w:lvlJc w:val="right"/>
+      <w:pPr>
+        <w:ind w:left="6480" w:hanging="180"/>
+      </w:pPr>
+    </w:lvl>
+  </w:abstractNum>
+  <w:abstractNum w:abstractNumId="2" w15:restartNumberingAfterBreak="0">
     <w:nsid w:val="4D481545"/>
     <w:multiLevelType w:val="hybridMultilevel"/>
     <w:tmpl w:val="1256AD1C"/>
@@ -1334,7 +1484,120 @@
       </w:pPr>
     </w:lvl>
   </w:abstractNum>
-  <w:abstractNum w:abstractNumId="2" w15:restartNumberingAfterBreak="0">
+  <w:abstractNum w:abstractNumId="3" w15:restartNumberingAfterBreak="0">
+    <w:nsid w:val="65732C5E"/>
+    <w:multiLevelType w:val="hybridMultilevel"/>
+    <w:tmpl w:val="8F52CFE0"/>
+    <w:lvl w:ilvl="0" w:tplc="04090001">
+      <w:start w:val="1"/>
+      <w:numFmt w:val="bullet"/>
+      <w:lvlText w:val=""/>
+      <w:lvlJc w:val="left"/>
+      <w:pPr>
+        <w:ind w:left="720" w:hanging="360"/>
+      </w:pPr>
+      <w:rPr>
+        <w:rFonts w:ascii="Symbol" w:hAnsi="Symbol" w:hint="default"/>
+      </w:rPr>
+    </w:lvl>
+    <w:lvl w:ilvl="1" w:tplc="04090003" w:tentative="1">
+      <w:start w:val="1"/>
+      <w:numFmt w:val="bullet"/>
+      <w:lvlText w:val="o"/>
+      <w:lvlJc w:val="left"/>
+      <w:pPr>
+        <w:ind w:left="1440" w:hanging="360"/>
+      </w:pPr>
+      <w:rPr>
+        <w:rFonts w:ascii="Courier New" w:hAnsi="Courier New" w:cs="Courier New" w:hint="default"/>
+      </w:rPr>
+    </w:lvl>
+    <w:lvl w:ilvl="2" w:tplc="04090005" w:tentative="1">
+      <w:start w:val="1"/>
+      <w:numFmt w:val="bullet"/>
+      <w:lvlText w:val=""/>
+      <w:lvlJc w:val="left"/>
+      <w:pPr>
+        <w:ind w:left="2160" w:hanging="360"/>
+      </w:pPr>
+      <w:rPr>
+        <w:rFonts w:ascii="Wingdings" w:hAnsi="Wingdings" w:hint="default"/>
+      </w:rPr>
+    </w:lvl>
+    <w:lvl w:ilvl="3" w:tplc="04090001" w:tentative="1">
+      <w:start w:val="1"/>
+      <w:numFmt w:val="bullet"/>
+      <w:lvlText w:val=""/>
+      <w:lvlJc w:val="left"/>
+      <w:pPr>
+        <w:ind w:left="2880" w:hanging="360"/>
+      </w:pPr>
+      <w:rPr>
+        <w:rFonts w:ascii="Symbol" w:hAnsi="Symbol" w:hint="default"/>
+      </w:rPr>
+    </w:lvl>
+    <w:lvl w:ilvl="4" w:tplc="04090003" w:tentative="1">
+      <w:start w:val="1"/>
+      <w:numFmt w:val="bullet"/>
+      <w:lvlText w:val="o"/>
+      <w:lvlJc w:val="left"/>
+      <w:pPr>
+        <w:ind w:left="3600" w:hanging="360"/>
+      </w:pPr>
+      <w:rPr>
+        <w:rFonts w:ascii="Courier New" w:hAnsi="Courier New" w:cs="Courier New" w:hint="default"/>
+      </w:rPr>
+    </w:lvl>
+    <w:lvl w:ilvl="5" w:tplc="04090005" w:tentative="1">
+      <w:start w:val="1"/>
+      <w:numFmt w:val="bullet"/>
+      <w:lvlText w:val=""/>
+      <w:lvlJc w:val="left"/>
+      <w:pPr>
+        <w:ind w:left="4320" w:hanging="360"/>
+      </w:pPr>
+      <w:rPr>
+        <w:rFonts w:ascii="Wingdings" w:hAnsi="Wingdings" w:hint="default"/>
+      </w:rPr>
+    </w:lvl>
+    <w:lvl w:ilvl="6" w:tplc="04090001" w:tentative="1">
+      <w:start w:val="1"/>
+      <w:numFmt w:val="bullet"/>
+      <w:lvlText w:val=""/>
+      <w:lvlJc w:val="left"/>
+      <w:pPr>
+        <w:ind w:left="5040" w:hanging="360"/>
+      </w:pPr>
+      <w:rPr>
+        <w:rFonts w:ascii="Symbol" w:hAnsi="Symbol" w:hint="default"/>
+      </w:rPr>
+    </w:lvl>
+    <w:lvl w:ilvl="7" w:tplc="04090003" w:tentative="1">
+      <w:start w:val="1"/>
+      <w:numFmt w:val="bullet"/>
+      <w:lvlText w:val="o"/>
+      <w:lvlJc w:val="left"/>
+      <w:pPr>
+        <w:ind w:left="5760" w:hanging="360"/>
+      </w:pPr>
+      <w:rPr>
+        <w:rFonts w:ascii="Courier New" w:hAnsi="Courier New" w:cs="Courier New" w:hint="default"/>
+      </w:rPr>
+    </w:lvl>
+    <w:lvl w:ilvl="8" w:tplc="04090005" w:tentative="1">
+      <w:start w:val="1"/>
+      <w:numFmt w:val="bullet"/>
+      <w:lvlText w:val=""/>
+      <w:lvlJc w:val="left"/>
+      <w:pPr>
+        <w:ind w:left="6480" w:hanging="360"/>
+      </w:pPr>
+      <w:rPr>
+        <w:rFonts w:ascii="Wingdings" w:hAnsi="Wingdings" w:hint="default"/>
+      </w:rPr>
+    </w:lvl>
+  </w:abstractNum>
+  <w:abstractNum w:abstractNumId="4" w15:restartNumberingAfterBreak="0">
     <w:nsid w:val="65DA22E9"/>
     <w:multiLevelType w:val="hybridMultilevel"/>
     <w:tmpl w:val="BA7A7762"/>
@@ -1427,9 +1690,15 @@
     <w:abstractNumId w:val="0"/>
   </w:num>
   <w:num w:numId="2" w16cid:durableId="1498112402">
+    <w:abstractNumId w:val="4"/>
+  </w:num>
+  <w:num w:numId="3" w16cid:durableId="930312042">
     <w:abstractNumId w:val="2"/>
   </w:num>
-  <w:num w:numId="3" w16cid:durableId="930312042">
+  <w:num w:numId="4" w16cid:durableId="110902952">
+    <w:abstractNumId w:val="3"/>
+  </w:num>
+  <w:num w:numId="5" w16cid:durableId="1182672108">
     <w:abstractNumId w:val="1"/>
   </w:num>
 </w:numbering>

</xml_diff>

<commit_message>
Modify fleet stats to include type of plane
</commit_message>
<xml_diff>
--- a/Project Report.docx
+++ b/Project Report.docx
@@ -87,6 +87,41 @@
     <w:p>
       <w:pPr>
         <w:spacing w:line="240" w:lineRule="auto"/>
+      </w:pPr>
+      <w:r>
+        <w:rPr>
+          <w:b/>
+          <w:bCs/>
+        </w:rPr>
+        <w:t xml:space="preserve">Project URL: </w:t>
+      </w:r>
+      <w:hyperlink r:id="rId5" w:history="1">
+        <w:r>
+          <w:rPr>
+            <w:rStyle w:val="Hyperlink"/>
+          </w:rPr>
+          <w:t>https://amohanty03-airline-management-database-app-a7kp6r.streamlit.app/</w:t>
+        </w:r>
+      </w:hyperlink>
+    </w:p>
+    <w:p>
+      <w:pPr>
+        <w:spacing w:line="240" w:lineRule="auto"/>
+      </w:pPr>
+      <w:r>
+        <w:rPr>
+          <w:b/>
+          <w:bCs/>
+        </w:rPr>
+        <w:t>NOTE:</w:t>
+      </w:r>
+      <w:r>
+        <w:t xml:space="preserve"> The link may not work on TAMU network as it was recently created.</w:t>
+      </w:r>
+    </w:p>
+    <w:p>
+      <w:pPr>
+        <w:spacing w:line="240" w:lineRule="auto"/>
         <w:rPr>
           <w:b/>
           <w:bCs/>
@@ -103,113 +138,199 @@
     <w:p>
       <w:pPr>
         <w:spacing w:line="240" w:lineRule="auto"/>
-      </w:pPr>
-      <w:r>
-        <w:t>The goal of this project is to develop a database application for an Airline Management System</w:t>
-      </w:r>
-      <w:r>
-        <w:t xml:space="preserve"> across US airports</w:t>
-      </w:r>
-      <w:r>
-        <w:t>. This system is designed to manage the core operational data of a commercial airline, including the scheduling of flights, management of aircraft fleets, and the processing of passenger reservations.</w:t>
-      </w:r>
-    </w:p>
-    <w:p>
-      <w:pPr>
-        <w:spacing w:line="240" w:lineRule="auto"/>
-      </w:pPr>
-      <w:r>
-        <w:t xml:space="preserve">The primary function of this system is to maintain data integrity while processing high-volume daily airline operations. It tracks real-world entities such as specific aircraft capacities, exact passenger passport identifications, employee payroll/roles, and airline flight scheduling. The </w:t>
-      </w:r>
-      <w:r>
-        <w:t>features</w:t>
-      </w:r>
-      <w:r>
-        <w:t xml:space="preserve"> provided by the graphical user interface (GUI) include:</w:t>
-      </w:r>
-    </w:p>
-    <w:p>
-      <w:pPr>
-        <w:pStyle w:val="ListParagraph"/>
-        <w:numPr>
-          <w:ilvl w:val="0"/>
-          <w:numId w:val="4"/>
-        </w:numPr>
-        <w:spacing w:line="240" w:lineRule="auto"/>
-      </w:pPr>
-      <w:r>
-        <w:t>Passenger Tracking: Allowing gate agents or administrators to view comprehensive passenger rosters for specific flights</w:t>
-      </w:r>
-    </w:p>
-    <w:p>
-      <w:pPr>
-        <w:pStyle w:val="ListParagraph"/>
-        <w:numPr>
-          <w:ilvl w:val="0"/>
-          <w:numId w:val="4"/>
-        </w:numPr>
-        <w:spacing w:line="240" w:lineRule="auto"/>
-      </w:pPr>
-      <w:r>
-        <w:t>Ticketing &amp; Cancellations: Processing new passenger bookings and canceling existing reservations</w:t>
-      </w:r>
-    </w:p>
-    <w:p>
-      <w:pPr>
-        <w:pStyle w:val="ListParagraph"/>
-        <w:numPr>
-          <w:ilvl w:val="0"/>
-          <w:numId w:val="4"/>
-        </w:numPr>
-        <w:spacing w:line="240" w:lineRule="auto"/>
-      </w:pPr>
-      <w:r>
-        <w:t xml:space="preserve">Logistical Analytics: Calculating the busiest transit hubs based on actual passenger traffic </w:t>
-      </w:r>
-    </w:p>
-    <w:p>
-      <w:pPr>
-        <w:pStyle w:val="ListParagraph"/>
-        <w:numPr>
-          <w:ilvl w:val="0"/>
-          <w:numId w:val="4"/>
-        </w:numPr>
-        <w:spacing w:line="240" w:lineRule="auto"/>
-      </w:pPr>
-      <w:r>
-        <w:t>Security &amp; Manifest Generation: Generating full flight manifests that combine both working crew members and ticketed passengers into a single list</w:t>
-      </w:r>
-    </w:p>
-    <w:p>
-      <w:pPr>
-        <w:pStyle w:val="ListParagraph"/>
-        <w:numPr>
-          <w:ilvl w:val="0"/>
-          <w:numId w:val="4"/>
-        </w:numPr>
-        <w:spacing w:line="240" w:lineRule="auto"/>
-      </w:pPr>
-      <w:r>
-        <w:t>Fleet Management Analytics: Aggregating data to determine airline operational scale and average fleet capacities</w:t>
-      </w:r>
-    </w:p>
-    <w:p>
-      <w:pPr>
-        <w:spacing w:line="240" w:lineRule="auto"/>
+        <w:rPr>
+          <w:b/>
+          <w:bCs/>
+        </w:rPr>
+      </w:pPr>
+      <w:r>
+        <w:rPr>
+          <w:b/>
+          <w:bCs/>
+        </w:rPr>
+        <w:t>Project Description</w:t>
+      </w:r>
+    </w:p>
+    <w:p>
+      <w:pPr>
+        <w:spacing w:line="240" w:lineRule="auto"/>
+      </w:pPr>
+      <w:r>
+        <w:t>This project focuses on the design and implementation of an Airline Management System</w:t>
+      </w:r>
+      <w:r>
+        <w:t xml:space="preserve"> in the United States</w:t>
+      </w:r>
+      <w:r>
+        <w:t xml:space="preserve">. In the real world, commercial airlines have to track a massive amount of interconnected data every day. They need to manage aircraft assignments, flight schedules, passenger ticketing, and employee shifts. If this data isn’t structured correctly, it </w:t>
+      </w:r>
+      <w:r>
+        <w:t xml:space="preserve">can </w:t>
+      </w:r>
+      <w:r>
+        <w:t xml:space="preserve">lead to issues </w:t>
+      </w:r>
+      <w:r>
+        <w:t>such as</w:t>
+      </w:r>
+      <w:r>
+        <w:t xml:space="preserve"> double-booked seats</w:t>
+      </w:r>
+      <w:r>
+        <w:t xml:space="preserve"> </w:t>
+      </w:r>
+      <w:r>
+        <w:t>or data inconsistencies. The goal of this project was to build a relational database that handles all these entities while maintaining strict referential integrity</w:t>
+      </w:r>
+      <w:r>
+        <w:t xml:space="preserve"> while</w:t>
+      </w:r>
+      <w:r>
+        <w:t xml:space="preserve"> preventing </w:t>
+      </w:r>
+      <w:r>
+        <w:t>redundancies and</w:t>
+      </w:r>
+      <w:r>
+        <w:t xml:space="preserve"> ensuring that records lin</w:t>
+      </w:r>
+      <w:r>
+        <w:t>e</w:t>
+      </w:r>
+      <w:r>
+        <w:t xml:space="preserve"> up correctly through primary and foreign keys.</w:t>
+      </w:r>
+    </w:p>
+    <w:p>
+      <w:pPr>
+        <w:spacing w:line="240" w:lineRule="auto"/>
+      </w:pPr>
+      <w:r>
+        <w:t>As an aviation enthusiast</w:t>
+      </w:r>
+      <w:r>
+        <w:t xml:space="preserve">, I </w:t>
+      </w:r>
+      <w:r>
+        <w:t xml:space="preserve">decided to </w:t>
+      </w:r>
+      <w:r>
+        <w:t>develop a full-stack database application</w:t>
+      </w:r>
+      <w:r>
+        <w:t xml:space="preserve"> to build an Airline Management Database</w:t>
+      </w:r>
+      <w:r>
+        <w:t>. The backend is a PostgreSQL database normalized to Boyce-Codd Normal Form (BCNF) to eliminate update anomalies. I originally built it locally and then migrated it to a cloud-hosted Neon database. For the frontend, I built a web-based graphical user interface (GUI) using Python and the Streamlit library, using SQLAlchemy as the database connector. The main purpose of the UI is to allow standard users</w:t>
+      </w:r>
+      <w:r>
+        <w:t xml:space="preserve"> </w:t>
+      </w:r>
+      <w:r>
+        <w:t>like ticketing agents or airline managers</w:t>
+      </w:r>
+      <w:r>
+        <w:t xml:space="preserve"> </w:t>
+      </w:r>
+      <w:r>
+        <w:t>to manipulate the database and run complex queries without needing to know any SQL.</w:t>
+      </w:r>
+    </w:p>
+    <w:p>
+      <w:pPr>
+        <w:spacing w:line="240" w:lineRule="auto"/>
+      </w:pPr>
+      <w:r>
+        <w:t xml:space="preserve">The application operates in a continuous loop through a web browser sidebar, offering six main functions to the user. </w:t>
+      </w:r>
+      <w:r>
+        <w:t xml:space="preserve">Users can input a flight number to view a passenger </w:t>
+      </w:r>
+      <w:r>
+        <w:t>manifest</w:t>
+      </w:r>
+      <w:r>
+        <w:t xml:space="preserve">, which uses SQL joins to connect the passenger and booking tables. </w:t>
+      </w:r>
+      <w:r>
+        <w:t>I</w:t>
+      </w:r>
+      <w:r>
+        <w:t>t</w:t>
+      </w:r>
+      <w:r>
+        <w:t xml:space="preserve"> also</w:t>
+      </w:r>
+      <w:r>
+        <w:t xml:space="preserve"> includes a ticketing system that lets users book a seat on a flight. This function verifies if a passenger’s passport exists in the database. If it’s a new passenger, the system prompts the user to input their name and phone number to create a profile before executing the SQL INSERT for the booking. I also built a cancellation feature that uses a DELETE statement to remove a specific booking based on the passport and flight number provided by the user.</w:t>
+      </w:r>
+      <w:r>
+        <w:t xml:space="preserve"> </w:t>
+      </w:r>
+      <w:r>
+        <w:t>There is also a flight manifest feature that uses the UNION set operator to merge employee and passenger data, returning a complete list of both crew and ticketholders on board a specific flight.</w:t>
+      </w:r>
+    </w:p>
+    <w:p>
+      <w:pPr>
+        <w:spacing w:line="240" w:lineRule="auto"/>
+      </w:pPr>
+      <w:r>
+        <w:t xml:space="preserve">Finally, I included two statistical functions for data analysis. Users can find the busiest airports by inputting how many top results they want to see. The system takes that input </w:t>
+      </w:r>
+      <w:r>
+        <w:lastRenderedPageBreak/>
+        <w:t xml:space="preserve">and uses aggregates and GROUP BY clauses to calculate the exact number of transiting passengers per airport </w:t>
+      </w:r>
+      <w:r>
+        <w:t xml:space="preserve">while </w:t>
+      </w:r>
+      <w:r>
+        <w:t>checking both origin and destination codes. There is also an airline fleet statistics page that uses correlated subqueries to show the total number of flights operated by each airline alongside the average capacity of the planes they are currently using. Overall, the system successfully translates airline data into an interactive</w:t>
+      </w:r>
+      <w:r>
+        <w:t xml:space="preserve"> and</w:t>
+      </w:r>
+      <w:r>
+        <w:t xml:space="preserve"> user-friendly dashboard.</w:t>
+      </w:r>
+    </w:p>
+    <w:p>
+      <w:pPr>
+        <w:spacing w:line="240" w:lineRule="auto"/>
+        <w:rPr>
+          <w:b/>
+          <w:bCs/>
+        </w:rPr>
+      </w:pPr>
+      <w:r>
+        <w:rPr>
+          <w:b/>
+          <w:bCs/>
+        </w:rPr>
+        <w:t>E/R Diagram</w:t>
+      </w:r>
+    </w:p>
+    <w:p>
+      <w:pPr>
+        <w:spacing w:line="240" w:lineRule="auto"/>
+        <w:rPr>
+          <w:b/>
+          <w:bCs/>
+        </w:rPr>
       </w:pPr>
       <w:r>
         <w:rPr>
           <w:noProof/>
         </w:rPr>
-        <w:lastRenderedPageBreak/>
         <w:drawing>
-          <wp:anchor distT="0" distB="0" distL="114300" distR="114300" simplePos="0" relativeHeight="251659264" behindDoc="1" locked="0" layoutInCell="1" allowOverlap="1" wp14:anchorId="52E37CCD" wp14:editId="7C379684">
+          <wp:anchor distT="0" distB="0" distL="114300" distR="114300" simplePos="0" relativeHeight="251659264" behindDoc="1" locked="0" layoutInCell="1" allowOverlap="1" wp14:anchorId="52E37CCD" wp14:editId="3EF70025">
             <wp:simplePos x="0" y="0"/>
-            <wp:positionH relativeFrom="page">
-              <wp:posOffset>914400</wp:posOffset>
+            <wp:positionH relativeFrom="margin">
+              <wp:align>right</wp:align>
             </wp:positionH>
             <wp:positionV relativeFrom="paragraph">
-              <wp:posOffset>289560</wp:posOffset>
+              <wp:posOffset>140335</wp:posOffset>
             </wp:positionV>
             <wp:extent cx="5943600" cy="3876675"/>
             <wp:effectExtent l="0" t="0" r="0" b="9525"/>
@@ -226,7 +347,7 @@
                     <pic:cNvPicPr/>
                   </pic:nvPicPr>
                   <pic:blipFill>
-                    <a:blip r:embed="rId5">
+                    <a:blip r:embed="rId6">
                       <a:extLst>
                         <a:ext uri="{28A0092B-C50C-407E-A947-70E740481C1C}">
                           <a14:useLocalDpi xmlns:a14="http://schemas.microsoft.com/office/drawing/2010/main" val="0"/>
@@ -252,15 +373,6 @@
           </wp:anchor>
         </w:drawing>
       </w:r>
-    </w:p>
-    <w:p>
-      <w:pPr>
-        <w:spacing w:line="240" w:lineRule="auto"/>
-        <w:rPr>
-          <w:b/>
-          <w:bCs/>
-        </w:rPr>
-      </w:pPr>
       <w:r>
         <w:rPr>
           <w:b/>
@@ -475,6 +587,13 @@
     <w:p>
       <w:pPr>
         <w:pStyle w:val="ListParagraph"/>
+        <w:spacing w:line="240" w:lineRule="auto"/>
+        <w:ind w:left="1440"/>
+      </w:pPr>
+    </w:p>
+    <w:p>
+      <w:pPr>
+        <w:pStyle w:val="ListParagraph"/>
         <w:numPr>
           <w:ilvl w:val="0"/>
           <w:numId w:val="3"/>
@@ -495,6 +614,7 @@
         <w:spacing w:line="240" w:lineRule="auto"/>
       </w:pPr>
       <w:r>
+        <w:lastRenderedPageBreak/>
         <w:t xml:space="preserve">PassportNum </w:t>
       </w:r>
       <w:r>
@@ -630,6 +750,13 @@
     <w:p>
       <w:pPr>
         <w:pStyle w:val="ListParagraph"/>
+        <w:spacing w:line="240" w:lineRule="auto"/>
+        <w:ind w:left="1440"/>
+      </w:pPr>
+    </w:p>
+    <w:p>
+      <w:pPr>
+        <w:pStyle w:val="ListParagraph"/>
         <w:numPr>
           <w:ilvl w:val="0"/>
           <w:numId w:val="3"/>
@@ -637,7 +764,6 @@
         <w:spacing w:line="240" w:lineRule="auto"/>
       </w:pPr>
       <w:r>
-        <w:lastRenderedPageBreak/>
         <w:t xml:space="preserve">To determine if the database schema is in Boyce-Codd Normal Form (BCNF), we must evaluate each relation to ensure that for every non-trivial functional dependency X → Y, the determinant X is a superkey. </w:t>
       </w:r>
     </w:p>
@@ -948,50 +1074,41 @@
         <w:spacing w:line="240" w:lineRule="auto"/>
       </w:pPr>
       <w:r>
-        <w:t>The d</w:t>
-      </w:r>
-      <w:r>
-        <w:t>ata</w:t>
-      </w:r>
-      <w:r>
-        <w:t xml:space="preserve"> for this</w:t>
-      </w:r>
-      <w:r>
-        <w:t xml:space="preserve"> was fabricated using a custom Python script utilizing the Faker library, </w:t>
-      </w:r>
-      <w:r>
-        <w:t>along</w:t>
-      </w:r>
-      <w:r>
-        <w:t xml:space="preserve"> with a manually curated dataset of real-world US Airport IATA codes and Major US Airline codes.</w:t>
-      </w:r>
-      <w:r>
-        <w:t xml:space="preserve"> </w:t>
-      </w:r>
-      <w:r>
-        <w:t>To ensure the uniqueness of key attributes, the Python script utilized Faker's .unique method for attributes like PassportNum and TailNum. For composite keys like in the Booking table, the script employed Python set() data structures and while loops to guarantee no duplicate (PassportNum, FlightNum) pairs were generated.</w:t>
-      </w:r>
-      <w:r>
-        <w:t xml:space="preserve"> </w:t>
-      </w:r>
-      <w:r>
-        <w:t>To avoid empty query results, the data generation strictly followed a parent-child hierarchy</w:t>
-      </w:r>
-      <w:r>
-        <w:t xml:space="preserve"> where i</w:t>
-      </w:r>
-      <w:r>
-        <w:t>ndependent tables (Airport, Aircraft, Passenger) were generated first. When generating dependent tables like Flight or Booking, the script specifically randomly selected foreign keys only from the pre-generated lists of primary keys. This ensured</w:t>
-      </w:r>
-      <w:r>
-        <w:t xml:space="preserve"> </w:t>
-      </w:r>
-      <w:r>
-        <w:t xml:space="preserve">referential integrity and guaranteed </w:t>
+        <w:t xml:space="preserve">The data for this was fabricated using a custom Python script utilizing the Faker library, along with a manually curated dataset of real-world US Airport IATA codes and Major US Airline codes. To ensure the uniqueness of key attributes, the Python script utilized Faker's .unique method for attributes like PassportNum and TailNum. </w:t>
       </w:r>
       <w:r>
         <w:lastRenderedPageBreak/>
-        <w:t>that every flight had valid airports, and every booking connected a valid passenger to a valid flight.</w:t>
+        <w:t xml:space="preserve">For composite keys like in the Booking table, the script </w:t>
+      </w:r>
+      <w:r>
+        <w:t>uses</w:t>
+      </w:r>
+      <w:r>
+        <w:t xml:space="preserve"> Python set() data structures and while loops to guarantee no duplicate (PassportNum, FlightNum) pairs were generated. To avoid empty query results, the data generation follow</w:t>
+      </w:r>
+      <w:r>
+        <w:t>s</w:t>
+      </w:r>
+      <w:r>
+        <w:t xml:space="preserve"> a parent-child hierarchy where independent tables (Airport, Aircraft, Passenger) were generated first. When generating dependent tables like Flight or Booking, the script randomly select</w:t>
+      </w:r>
+      <w:r>
+        <w:t>s</w:t>
+      </w:r>
+      <w:r>
+        <w:t xml:space="preserve"> foreign keys only from the pre-generated lists of primary keys. This ensure</w:t>
+      </w:r>
+      <w:r>
+        <w:t>s</w:t>
+      </w:r>
+      <w:r>
+        <w:t xml:space="preserve"> referential integrity and guarantee</w:t>
+      </w:r>
+      <w:r>
+        <w:t>s</w:t>
+      </w:r>
+      <w:r>
+        <w:t xml:space="preserve"> that every flight had valid airports, and every booking connected a valid passenger to a valid flight.</w:t>
       </w:r>
     </w:p>
     <w:p>
@@ -1048,13 +1165,7 @@
         <w:t xml:space="preserve">Book a New Flight: </w:t>
       </w:r>
       <w:r>
-        <w:t xml:space="preserve">Searches for whether the passenger already exists in the system. If no, they’re added to the Passenger and then the Booking table. If yes, </w:t>
-      </w:r>
-      <w:r>
-        <w:t>they’re added to the Booking table</w:t>
-      </w:r>
-      <w:r>
-        <w:t xml:space="preserve"> only. </w:t>
+        <w:t xml:space="preserve">Searches for whether the passenger already exists in the system. If no, they’re added to the Passenger and then the Booking table. If yes, they’re added to the Booking table only. </w:t>
       </w:r>
       <w:r>
         <w:t>Uses an INSERT INTO statement to modify the database with a new passenger reservation.</w:t>
@@ -1182,6 +1293,554 @@
       <w:r>
         <w:t>.</w:t>
       </w:r>
+      <w:r>
+        <w:t xml:space="preserve"> After running the script </w:t>
+      </w:r>
+      <w:r>
+        <w:rPr>
+          <w:i/>
+          <w:iCs/>
+        </w:rPr>
+        <w:t>data.py</w:t>
+      </w:r>
+      <w:r>
+        <w:t>, 8 CSV files were generated which were then imported into the PostgreSQL Database. The following queries were used to create the tables.</w:t>
+      </w:r>
+    </w:p>
+    <w:p>
+      <w:pPr>
+        <w:pStyle w:val="ListParagraph"/>
+        <w:spacing w:line="240" w:lineRule="auto"/>
+      </w:pPr>
+      <w:r>
+        <w:t>CREATE TABLE Airport (</w:t>
+      </w:r>
+    </w:p>
+    <w:p>
+      <w:pPr>
+        <w:pStyle w:val="ListParagraph"/>
+        <w:spacing w:line="240" w:lineRule="auto"/>
+      </w:pPr>
+      <w:r>
+        <w:t xml:space="preserve">    IATACode CHAR(3) PRIMARY KEY,</w:t>
+      </w:r>
+    </w:p>
+    <w:p>
+      <w:pPr>
+        <w:pStyle w:val="ListParagraph"/>
+        <w:spacing w:line="240" w:lineRule="auto"/>
+      </w:pPr>
+      <w:r>
+        <w:t xml:space="preserve">    City VARCHAR(100),</w:t>
+      </w:r>
+    </w:p>
+    <w:p>
+      <w:pPr>
+        <w:pStyle w:val="ListParagraph"/>
+        <w:spacing w:line="240" w:lineRule="auto"/>
+      </w:pPr>
+      <w:r>
+        <w:t xml:space="preserve">    State VARCHAR(100),</w:t>
+      </w:r>
+    </w:p>
+    <w:p>
+      <w:pPr>
+        <w:pStyle w:val="ListParagraph"/>
+        <w:spacing w:line="240" w:lineRule="auto"/>
+      </w:pPr>
+      <w:r>
+        <w:t xml:space="preserve">    Country VARCHAR(100)</w:t>
+      </w:r>
+    </w:p>
+    <w:p>
+      <w:pPr>
+        <w:pStyle w:val="ListParagraph"/>
+        <w:spacing w:line="240" w:lineRule="auto"/>
+      </w:pPr>
+      <w:r>
+        <w:t>);</w:t>
+      </w:r>
+    </w:p>
+    <w:p>
+      <w:pPr>
+        <w:pStyle w:val="ListParagraph"/>
+        <w:spacing w:line="240" w:lineRule="auto"/>
+      </w:pPr>
+    </w:p>
+    <w:p>
+      <w:pPr>
+        <w:pStyle w:val="ListParagraph"/>
+        <w:spacing w:line="240" w:lineRule="auto"/>
+      </w:pPr>
+      <w:r>
+        <w:t>CREATE TABLE Aircraft (</w:t>
+      </w:r>
+    </w:p>
+    <w:p>
+      <w:pPr>
+        <w:pStyle w:val="ListParagraph"/>
+        <w:spacing w:line="240" w:lineRule="auto"/>
+      </w:pPr>
+      <w:r>
+        <w:t xml:space="preserve">    TailNum VARCHAR(10) PRIMARY KEY,</w:t>
+      </w:r>
+    </w:p>
+    <w:p>
+      <w:pPr>
+        <w:pStyle w:val="ListParagraph"/>
+        <w:spacing w:line="240" w:lineRule="auto"/>
+      </w:pPr>
+      <w:r>
+        <w:t xml:space="preserve">    Model VARCHAR(50),</w:t>
+      </w:r>
+    </w:p>
+    <w:p>
+      <w:pPr>
+        <w:pStyle w:val="ListParagraph"/>
+        <w:spacing w:line="240" w:lineRule="auto"/>
+      </w:pPr>
+      <w:r>
+        <w:t xml:space="preserve">    Capacity INT</w:t>
+      </w:r>
+    </w:p>
+    <w:p>
+      <w:pPr>
+        <w:pStyle w:val="ListParagraph"/>
+        <w:spacing w:line="240" w:lineRule="auto"/>
+      </w:pPr>
+      <w:r>
+        <w:t>);</w:t>
+      </w:r>
+    </w:p>
+    <w:p>
+      <w:pPr>
+        <w:pStyle w:val="ListParagraph"/>
+        <w:spacing w:line="240" w:lineRule="auto"/>
+      </w:pPr>
+    </w:p>
+    <w:p>
+      <w:pPr>
+        <w:pStyle w:val="ListParagraph"/>
+        <w:spacing w:line="240" w:lineRule="auto"/>
+      </w:pPr>
+      <w:r>
+        <w:t>CREATE TABLE Passenger (</w:t>
+      </w:r>
+    </w:p>
+    <w:p>
+      <w:pPr>
+        <w:pStyle w:val="ListParagraph"/>
+        <w:spacing w:line="240" w:lineRule="auto"/>
+      </w:pPr>
+      <w:r>
+        <w:t xml:space="preserve">    PassportNum VARCHAR(20) PRIMARY KEY,</w:t>
+      </w:r>
+    </w:p>
+    <w:p>
+      <w:pPr>
+        <w:pStyle w:val="ListParagraph"/>
+        <w:spacing w:line="240" w:lineRule="auto"/>
+      </w:pPr>
+      <w:r>
+        <w:t xml:space="preserve">    Name VARCHAR(100),</w:t>
+      </w:r>
+    </w:p>
+    <w:p>
+      <w:pPr>
+        <w:pStyle w:val="ListParagraph"/>
+        <w:spacing w:line="240" w:lineRule="auto"/>
+      </w:pPr>
+      <w:r>
+        <w:t xml:space="preserve">    Phone VARCHAR(20)</w:t>
+      </w:r>
+    </w:p>
+    <w:p>
+      <w:pPr>
+        <w:pStyle w:val="ListParagraph"/>
+        <w:spacing w:line="240" w:lineRule="auto"/>
+      </w:pPr>
+      <w:r>
+        <w:t>);</w:t>
+      </w:r>
+    </w:p>
+    <w:p>
+      <w:pPr>
+        <w:pStyle w:val="ListParagraph"/>
+        <w:spacing w:line="240" w:lineRule="auto"/>
+      </w:pPr>
+    </w:p>
+    <w:p>
+      <w:pPr>
+        <w:pStyle w:val="ListParagraph"/>
+        <w:spacing w:line="240" w:lineRule="auto"/>
+      </w:pPr>
+      <w:r>
+        <w:t>CREATE TABLE Employee (</w:t>
+      </w:r>
+    </w:p>
+    <w:p>
+      <w:pPr>
+        <w:pStyle w:val="ListParagraph"/>
+        <w:spacing w:line="240" w:lineRule="auto"/>
+      </w:pPr>
+      <w:r>
+        <w:t xml:space="preserve">    EmployeeID INT PRIMARY KEY,</w:t>
+      </w:r>
+    </w:p>
+    <w:p>
+      <w:pPr>
+        <w:pStyle w:val="ListParagraph"/>
+        <w:spacing w:line="240" w:lineRule="auto"/>
+      </w:pPr>
+      <w:r>
+        <w:t xml:space="preserve">    Name VARCHAR(100),</w:t>
+      </w:r>
+    </w:p>
+    <w:p>
+      <w:pPr>
+        <w:pStyle w:val="ListParagraph"/>
+        <w:spacing w:line="240" w:lineRule="auto"/>
+      </w:pPr>
+      <w:r>
+        <w:t xml:space="preserve">    Role VARCHAR(50),</w:t>
+      </w:r>
+    </w:p>
+    <w:p>
+      <w:pPr>
+        <w:pStyle w:val="ListParagraph"/>
+        <w:spacing w:line="240" w:lineRule="auto"/>
+      </w:pPr>
+      <w:r>
+        <w:t xml:space="preserve">    Salary INT</w:t>
+      </w:r>
+    </w:p>
+    <w:p>
+      <w:pPr>
+        <w:pStyle w:val="ListParagraph"/>
+        <w:spacing w:line="240" w:lineRule="auto"/>
+      </w:pPr>
+      <w:r>
+        <w:t>);</w:t>
+      </w:r>
+    </w:p>
+    <w:p>
+      <w:pPr>
+        <w:pStyle w:val="ListParagraph"/>
+        <w:spacing w:line="240" w:lineRule="auto"/>
+      </w:pPr>
+    </w:p>
+    <w:p>
+      <w:pPr>
+        <w:pStyle w:val="ListParagraph"/>
+        <w:spacing w:line="240" w:lineRule="auto"/>
+      </w:pPr>
+      <w:r>
+        <w:t>CREATE TABLE Airline (</w:t>
+      </w:r>
+    </w:p>
+    <w:p>
+      <w:pPr>
+        <w:pStyle w:val="ListParagraph"/>
+        <w:spacing w:line="240" w:lineRule="auto"/>
+      </w:pPr>
+      <w:r>
+        <w:t xml:space="preserve">    AirlineCode CHAR(2) PRIMARY KEY,</w:t>
+      </w:r>
+    </w:p>
+    <w:p>
+      <w:pPr>
+        <w:pStyle w:val="ListParagraph"/>
+        <w:spacing w:line="240" w:lineRule="auto"/>
+      </w:pPr>
+      <w:r>
+        <w:t xml:space="preserve">    Name VARCHAR(100)</w:t>
+      </w:r>
+    </w:p>
+    <w:p>
+      <w:pPr>
+        <w:pStyle w:val="ListParagraph"/>
+        <w:spacing w:line="240" w:lineRule="auto"/>
+      </w:pPr>
+      <w:r>
+        <w:t>);</w:t>
+      </w:r>
+    </w:p>
+    <w:p>
+      <w:pPr>
+        <w:pStyle w:val="ListParagraph"/>
+        <w:spacing w:line="240" w:lineRule="auto"/>
+      </w:pPr>
+    </w:p>
+    <w:p>
+      <w:pPr>
+        <w:pStyle w:val="ListParagraph"/>
+        <w:spacing w:line="240" w:lineRule="auto"/>
+      </w:pPr>
+      <w:r>
+        <w:t>CREATE TABLE Flight (</w:t>
+      </w:r>
+    </w:p>
+    <w:p>
+      <w:pPr>
+        <w:pStyle w:val="ListParagraph"/>
+        <w:spacing w:line="240" w:lineRule="auto"/>
+      </w:pPr>
+      <w:r>
+        <w:t xml:space="preserve">    FlightNum VARCHAR(10) PRIMARY KEY,</w:t>
+      </w:r>
+    </w:p>
+    <w:p>
+      <w:pPr>
+        <w:pStyle w:val="ListParagraph"/>
+        <w:spacing w:line="240" w:lineRule="auto"/>
+      </w:pPr>
+      <w:r>
+        <w:t xml:space="preserve">    Time TIMESTAMP,</w:t>
+      </w:r>
+    </w:p>
+    <w:p>
+      <w:pPr>
+        <w:pStyle w:val="ListParagraph"/>
+        <w:spacing w:line="240" w:lineRule="auto"/>
+      </w:pPr>
+      <w:r>
+        <w:t xml:space="preserve">    Status VARCHAR(20),</w:t>
+      </w:r>
+    </w:p>
+    <w:p>
+      <w:pPr>
+        <w:pStyle w:val="ListParagraph"/>
+        <w:spacing w:line="240" w:lineRule="auto"/>
+      </w:pPr>
+      <w:r>
+        <w:t xml:space="preserve">    TailNum VARCHAR(10),</w:t>
+      </w:r>
+    </w:p>
+    <w:p>
+      <w:pPr>
+        <w:pStyle w:val="ListParagraph"/>
+        <w:spacing w:line="240" w:lineRule="auto"/>
+      </w:pPr>
+      <w:r>
+        <w:t xml:space="preserve">    OriginCode CHAR(3),</w:t>
+      </w:r>
+    </w:p>
+    <w:p>
+      <w:pPr>
+        <w:pStyle w:val="ListParagraph"/>
+        <w:spacing w:line="240" w:lineRule="auto"/>
+      </w:pPr>
+      <w:r>
+        <w:t xml:space="preserve">    DestCode CHAR(3),</w:t>
+      </w:r>
+    </w:p>
+    <w:p>
+      <w:pPr>
+        <w:pStyle w:val="ListParagraph"/>
+        <w:spacing w:line="240" w:lineRule="auto"/>
+      </w:pPr>
+      <w:r>
+        <w:t xml:space="preserve">    AirlineCode CHAR(2),</w:t>
+      </w:r>
+    </w:p>
+    <w:p>
+      <w:pPr>
+        <w:pStyle w:val="ListParagraph"/>
+        <w:spacing w:line="240" w:lineRule="auto"/>
+      </w:pPr>
+      <w:r>
+        <w:t xml:space="preserve">    FOREIGN KEY (TailNum) REFERENCES Aircraft(TailNum),</w:t>
+      </w:r>
+    </w:p>
+    <w:p>
+      <w:pPr>
+        <w:pStyle w:val="ListParagraph"/>
+        <w:spacing w:line="240" w:lineRule="auto"/>
+      </w:pPr>
+      <w:r>
+        <w:t xml:space="preserve">    FOREIGN KEY (OriginCode) REFERENCES Airport(IATACode),</w:t>
+      </w:r>
+    </w:p>
+    <w:p>
+      <w:pPr>
+        <w:pStyle w:val="ListParagraph"/>
+        <w:spacing w:line="240" w:lineRule="auto"/>
+      </w:pPr>
+      <w:r>
+        <w:t xml:space="preserve">    FOREIGN KEY (DestCode) REFERENCES Airport(IATACode),</w:t>
+      </w:r>
+    </w:p>
+    <w:p>
+      <w:pPr>
+        <w:pStyle w:val="ListParagraph"/>
+        <w:spacing w:line="240" w:lineRule="auto"/>
+      </w:pPr>
+      <w:r>
+        <w:t xml:space="preserve">    FOREIGN KEY (AirlineCode) REFERENCES Airline(AirlineCode) -- NEW FOREIGN KEY</w:t>
+      </w:r>
+    </w:p>
+    <w:p>
+      <w:pPr>
+        <w:pStyle w:val="ListParagraph"/>
+        <w:spacing w:line="240" w:lineRule="auto"/>
+      </w:pPr>
+      <w:r>
+        <w:t>);</w:t>
+      </w:r>
+    </w:p>
+    <w:p>
+      <w:pPr>
+        <w:pStyle w:val="ListParagraph"/>
+        <w:spacing w:line="240" w:lineRule="auto"/>
+      </w:pPr>
+    </w:p>
+    <w:p>
+      <w:pPr>
+        <w:pStyle w:val="ListParagraph"/>
+        <w:spacing w:line="240" w:lineRule="auto"/>
+      </w:pPr>
+      <w:r>
+        <w:t>CREATE TABLE Booking (</w:t>
+      </w:r>
+    </w:p>
+    <w:p>
+      <w:pPr>
+        <w:pStyle w:val="ListParagraph"/>
+        <w:spacing w:line="240" w:lineRule="auto"/>
+      </w:pPr>
+      <w:r>
+        <w:t xml:space="preserve">    PassportNum VARCHAR(20),</w:t>
+      </w:r>
+    </w:p>
+    <w:p>
+      <w:pPr>
+        <w:pStyle w:val="ListParagraph"/>
+        <w:spacing w:line="240" w:lineRule="auto"/>
+      </w:pPr>
+      <w:r>
+        <w:t xml:space="preserve">    FlightNum VARCHAR(10),</w:t>
+      </w:r>
+    </w:p>
+    <w:p>
+      <w:pPr>
+        <w:pStyle w:val="ListParagraph"/>
+        <w:spacing w:line="240" w:lineRule="auto"/>
+      </w:pPr>
+      <w:r>
+        <w:t xml:space="preserve">    SeatNum VARCHAR(5),</w:t>
+      </w:r>
+    </w:p>
+    <w:p>
+      <w:pPr>
+        <w:pStyle w:val="ListParagraph"/>
+        <w:spacing w:line="240" w:lineRule="auto"/>
+      </w:pPr>
+      <w:r>
+        <w:t xml:space="preserve">    PRIMARY KEY (PassportNum, FlightNum),</w:t>
+      </w:r>
+    </w:p>
+    <w:p>
+      <w:pPr>
+        <w:pStyle w:val="ListParagraph"/>
+        <w:spacing w:line="240" w:lineRule="auto"/>
+      </w:pPr>
+      <w:r>
+        <w:t xml:space="preserve">    FOREIGN KEY (PassportNum) REFERENCES Passenger(PassportNum),</w:t>
+      </w:r>
+    </w:p>
+    <w:p>
+      <w:pPr>
+        <w:pStyle w:val="ListParagraph"/>
+        <w:spacing w:line="240" w:lineRule="auto"/>
+      </w:pPr>
+      <w:r>
+        <w:t xml:space="preserve">    FOREIGN KEY (FlightNum) REFERENCES Flight(FlightNum)</w:t>
+      </w:r>
+    </w:p>
+    <w:p>
+      <w:pPr>
+        <w:pStyle w:val="ListParagraph"/>
+        <w:spacing w:line="240" w:lineRule="auto"/>
+      </w:pPr>
+      <w:r>
+        <w:t>);</w:t>
+      </w:r>
+    </w:p>
+    <w:p>
+      <w:pPr>
+        <w:pStyle w:val="ListParagraph"/>
+        <w:spacing w:line="240" w:lineRule="auto"/>
+      </w:pPr>
+    </w:p>
+    <w:p>
+      <w:pPr>
+        <w:pStyle w:val="ListParagraph"/>
+        <w:spacing w:line="240" w:lineRule="auto"/>
+      </w:pPr>
+      <w:r>
+        <w:t>CREATE TABLE Staffing (</w:t>
+      </w:r>
+    </w:p>
+    <w:p>
+      <w:pPr>
+        <w:pStyle w:val="ListParagraph"/>
+        <w:spacing w:line="240" w:lineRule="auto"/>
+      </w:pPr>
+      <w:r>
+        <w:lastRenderedPageBreak/>
+        <w:t xml:space="preserve">    EmployeeID INT,</w:t>
+      </w:r>
+    </w:p>
+    <w:p>
+      <w:pPr>
+        <w:pStyle w:val="ListParagraph"/>
+        <w:spacing w:line="240" w:lineRule="auto"/>
+      </w:pPr>
+      <w:r>
+        <w:t xml:space="preserve">    FlightNum VARCHAR(10),</w:t>
+      </w:r>
+    </w:p>
+    <w:p>
+      <w:pPr>
+        <w:pStyle w:val="ListParagraph"/>
+        <w:spacing w:line="240" w:lineRule="auto"/>
+      </w:pPr>
+      <w:r>
+        <w:t xml:space="preserve">    PRIMARY KEY (EmployeeID, FlightNum),</w:t>
+      </w:r>
+    </w:p>
+    <w:p>
+      <w:pPr>
+        <w:pStyle w:val="ListParagraph"/>
+        <w:spacing w:line="240" w:lineRule="auto"/>
+      </w:pPr>
+      <w:r>
+        <w:t xml:space="preserve">    FOREIGN KEY (EmployeeID) REFERENCES Employee(EmployeeID),</w:t>
+      </w:r>
+    </w:p>
+    <w:p>
+      <w:pPr>
+        <w:pStyle w:val="ListParagraph"/>
+        <w:spacing w:line="240" w:lineRule="auto"/>
+      </w:pPr>
+      <w:r>
+        <w:t xml:space="preserve">    FOREIGN KEY (FlightNum) REFERENCES Flight(FlightNum)</w:t>
+      </w:r>
+    </w:p>
+    <w:p>
+      <w:pPr>
+        <w:pStyle w:val="ListParagraph"/>
+        <w:spacing w:line="240" w:lineRule="auto"/>
+      </w:pPr>
+      <w:r>
+        <w:t>);</w:t>
+      </w:r>
+    </w:p>
+    <w:p>
+      <w:pPr>
+        <w:pStyle w:val="ListParagraph"/>
+        <w:spacing w:line="240" w:lineRule="auto"/>
+      </w:pPr>
     </w:p>
     <w:p>
       <w:pPr>
@@ -1193,16 +1852,46 @@
         <w:spacing w:line="240" w:lineRule="auto"/>
       </w:pPr>
       <w:r>
-        <w:t>A major challenge was designing the database and trying to figure out the overall picture of what attributes are necessary, which required quite a few iterations. Another significant challenge I encountered was managing foreign key constraint violations during the data import phase. When initially testing the data generation script, generating child tables (like Booking) without generating parent tables (Passenger) resulted in fatal psql exit codes during import. I overcame this by implementing a strict TRUNCATE ... CASCADE workflow and ensuring the Python script generated all related datasets simultaneously to maintain referential integrity.</w:t>
-      </w:r>
-    </w:p>
-    <w:p>
-      <w:pPr>
-        <w:pStyle w:val="ListParagraph"/>
-        <w:spacing w:line="240" w:lineRule="auto"/>
-      </w:pPr>
-      <w:r>
-        <w:t>Another challenge involved bridging Python web frameworks with SQL parameters. I initially faced a database-connection compatibility issue in pandas as it only supports SQLAlchemy connectable, whereas I was solely using a psycopg2 connection. This required me to revise all queries to support the SQLAlchemy format. Additionally, when attempting to pass user input into a LIMIT clause using Pandas' read_sql_query, the underlying SQLAlchemy engine misinterpreted the %s placeholder, causing syntax errors. I resolved this by utilizing safe string concatenation for integers. Ultimately, this project provided valuable hands-on experience in full-stack database development, from E-R modeling to UI deployment.</w:t>
+        <w:t xml:space="preserve">A major challenge was designing the database and trying to figure out the overall picture of what attributes are necessary, which required quite a few iterations. Another significant challenge I encountered was managing foreign key constraint violations during the data import phase. When initially testing the data generation script, generating child tables (like Booking) without generating parent tables (Passenger) resulted in fatal psql exit codes during import. I </w:t>
+      </w:r>
+      <w:r>
+        <w:t>fixed</w:t>
+      </w:r>
+      <w:r>
+        <w:t xml:space="preserve"> this by implementing a TRUNCATE ... CASCADE workflow and ensuring the Python script generated all related datasets simultaneously </w:t>
+      </w:r>
+      <w:r>
+        <w:t>while maintaining</w:t>
+      </w:r>
+      <w:r>
+        <w:t xml:space="preserve"> referential integrity.</w:t>
+      </w:r>
+    </w:p>
+    <w:p>
+      <w:pPr>
+        <w:pStyle w:val="ListParagraph"/>
+        <w:spacing w:line="240" w:lineRule="auto"/>
+      </w:pPr>
+      <w:r>
+        <w:t xml:space="preserve">Another challenge involved bridging Python web frameworks with SQL parameters. I initially faced a database-connection compatibility issue in pandas as it only supports SQLAlchemy connectable, whereas I was solely using a psycopg2 connection. This required me to revise all queries to support the SQLAlchemy format. Additionally, when attempting to pass user input into a LIMIT clause using Pandas' read_sql_query, the underlying SQLAlchemy engine misinterpreted the %s placeholder, causing syntax errors. I resolved this by utilizing safe string concatenation for integers. </w:t>
+      </w:r>
+      <w:r>
+        <w:t>T</w:t>
+      </w:r>
+      <w:r>
+        <w:t>his project provided valuable hands-on experience in full-stack database development, from E-R modeling to</w:t>
+      </w:r>
+      <w:r>
+        <w:t xml:space="preserve"> a cloud-based</w:t>
+      </w:r>
+      <w:r>
+        <w:t xml:space="preserve"> UI deployment</w:t>
+      </w:r>
+      <w:r>
+        <w:t xml:space="preserve"> while also working on something that interests me</w:t>
+      </w:r>
+      <w:r>
+        <w:t>.</w:t>
       </w:r>
     </w:p>
     <w:sectPr>
@@ -2308,7 +2997,6 @@
   <w:style w:type="character" w:default="1" w:styleId="DefaultParagraphFont">
     <w:name w:val="Default Paragraph Font"/>
     <w:uiPriority w:val="1"/>
-    <w:semiHidden/>
     <w:unhideWhenUsed/>
   </w:style>
   <w:style w:type="table" w:default="1" w:styleId="TableNormal">
@@ -2622,6 +3310,29 @@
       <w:spacing w:val="5"/>
     </w:rPr>
   </w:style>
+  <w:style w:type="character" w:styleId="Hyperlink">
+    <w:name w:val="Hyperlink"/>
+    <w:basedOn w:val="DefaultParagraphFont"/>
+    <w:uiPriority w:val="99"/>
+    <w:unhideWhenUsed/>
+    <w:rsid w:val="003C4706"/>
+    <w:rPr>
+      <w:color w:val="467886" w:themeColor="hyperlink"/>
+      <w:u w:val="single"/>
+    </w:rPr>
+  </w:style>
+  <w:style w:type="character" w:styleId="UnresolvedMention">
+    <w:name w:val="Unresolved Mention"/>
+    <w:basedOn w:val="DefaultParagraphFont"/>
+    <w:uiPriority w:val="99"/>
+    <w:semiHidden/>
+    <w:unhideWhenUsed/>
+    <w:rsid w:val="003C4706"/>
+    <w:rPr>
+      <w:color w:val="605E5C"/>
+      <w:shd w:val="clear" w:color="auto" w:fill="E1DFDD"/>
+    </w:rPr>
+  </w:style>
 </w:styles>
 </file>
 

</xml_diff>